<commit_message>
Combined pre-bible: one-page shortlist, measured table column widths (tools/fit_table_widths.py), Doc re-uploaded
Co-Authored-By: Claude Opus 5.5 <noreply@anthropic.com>
Claude-Session: https://claude.ai/code/session_01JXZTYoXrbpFAh6f3eiaAfw
</commit_message>
<xml_diff>
--- a/runs/W_10212026/10_16_and_10_21_Pre_Bible_Pitch.docx
+++ b/runs/W_10212026/10_16_and_10_21_Pre_Bible_Pitch.docx
@@ -15,25 +15,22 @@
     </w:p>
     <w:p>
       <w:r>
-        <w:t xml:space="preserve">Shows: </w:t>
-      </w:r>
-      <w:r>
         <w:rPr>
           <w:b/>
         </w:rPr>
-        <w:t>Fri Oct 16, 2026 (F1, live, deals with Trey Donovan)</w:t>
-      </w:r>
-      <w:r>
-        <w:t xml:space="preserve"> and </w:t>
+        <w:t>F1 Fri 10/16</w:t>
+      </w:r>
+      <w:r>
+        <w:t xml:space="preserve"> (live, deals with Trey Donovan) and </w:t>
       </w:r>
       <w:r>
         <w:rPr>
           <w:b/>
         </w:rPr>
-        <w:t>Wed Oct 21, 2026 (F2 story show, tapes Fri Oct 16)</w:t>
-      </w:r>
-      <w:r>
-        <w:t xml:space="preserve"> · One slate for both, every story pitched as an A unless marked · Prepared Sun, Oct 11, 2026 · Kyle and David's list plus our own research. Checked against official releases, police and court reporting, and YouTube counts observed Oct 11. Repeats checked against the 62 transcripts, the full 9/29 channel title list (Jan–Sep) and the 10/7, 10/9 and 10/14 bibles. Audience 55+. F1 rule: nothing knocks Amazon.</w:t>
+        <w:t>F2 Wed 10/21</w:t>
+      </w:r>
+      <w:r>
+        <w:t xml:space="preserve"> (tapes 10/16) · Prepared Oct 11 · Views observed Oct 11 · Repeats checked against transcripts, the Jan–Sep title list and the 10/7–10/14 bibles · F1 rule: nothing knocks Amazon.</w:t>
       </w:r>
     </w:p>
     <w:p>
@@ -54,19 +51,20 @@
         <w:tblW w:type="auto" w:w="0"/>
         <w:jc w:val="center"/>
         <w:tblLook w:firstColumn="1" w:firstRow="1" w:lastColumn="0" w:lastRow="0" w:noHBand="0" w:noVBand="1" w:val="04A0"/>
+        <w:tblLayout w:type="fixed"/>
       </w:tblPr>
       <w:tblGrid>
-        <w:gridCol w:w="1656"/>
-        <w:gridCol w:w="1656"/>
-        <w:gridCol w:w="1656"/>
-        <w:gridCol w:w="1656"/>
-        <w:gridCol w:w="1656"/>
-        <w:gridCol w:w="1656"/>
+        <w:gridCol w:w="432"/>
+        <w:gridCol w:w="1800"/>
+        <w:gridCol w:w="3744"/>
+        <w:gridCol w:w="1440"/>
+        <w:gridCol w:w="1224"/>
+        <w:gridCol w:w="1296"/>
       </w:tblGrid>
       <w:tr>
         <w:tc>
           <w:tcPr>
-            <w:tcW w:type="dxa" w:w="504"/>
+            <w:tcW w:type="dxa" w:w="432"/>
           </w:tcPr>
           <w:p>
             <w:r>
@@ -80,7 +78,7 @@
         </w:tc>
         <w:tc>
           <w:tcPr>
-            <w:tcW w:type="dxa" w:w="2088"/>
+            <w:tcW w:type="dxa" w:w="1800"/>
           </w:tcPr>
           <w:p>
             <w:r>
@@ -94,7 +92,7 @@
         </w:tc>
         <w:tc>
           <w:tcPr>
-            <w:tcW w:type="dxa" w:w="3384"/>
+            <w:tcW w:type="dxa" w:w="3744"/>
           </w:tcPr>
           <w:p>
             <w:r>
@@ -108,7 +106,7 @@
         </w:tc>
         <w:tc>
           <w:tcPr>
-            <w:tcW w:type="dxa" w:w="1224"/>
+            <w:tcW w:type="dxa" w:w="1440"/>
           </w:tcPr>
           <w:p>
             <w:r>
@@ -122,7 +120,7 @@
         </w:tc>
         <w:tc>
           <w:tcPr>
-            <w:tcW w:type="dxa" w:w="1656"/>
+            <w:tcW w:type="dxa" w:w="1224"/>
           </w:tcPr>
           <w:p>
             <w:r>
@@ -136,7 +134,7 @@
         </w:tc>
         <w:tc>
           <w:tcPr>
-            <w:tcW w:type="dxa" w:w="1224"/>
+            <w:tcW w:type="dxa" w:w="1296"/>
           </w:tcPr>
           <w:p>
             <w:r>
@@ -152,7 +150,7 @@
       <w:tr>
         <w:tc>
           <w:tcPr>
-            <w:tcW w:type="dxa" w:w="504"/>
+            <w:tcW w:type="dxa" w:w="432"/>
           </w:tcPr>
           <w:p>
             <w:pPr>
@@ -168,7 +166,7 @@
         </w:tc>
         <w:tc>
           <w:tcPr>
-            <w:tcW w:type="dxa" w:w="2088"/>
+            <w:tcW w:type="dxa" w:w="1800"/>
           </w:tcPr>
           <w:p>
             <w:pPr>
@@ -179,13 +177,13 @@
                 <w:b/>
                 <w:sz w:val="19"/>
               </w:rPr>
-              <w:t>THE CASHIER KEPT HIS WINNING TICKET</w:t>
+              <w:t>LOTTERY CLERK</w:t>
             </w:r>
           </w:p>
         </w:tc>
         <w:tc>
           <w:tcPr>
-            <w:tcW w:type="dxa" w:w="3384"/>
+            <w:tcW w:type="dxa" w:w="3744"/>
           </w:tcPr>
           <w:p>
             <w:pPr>
@@ -195,7 +193,23 @@
               <w:rPr>
                 <w:sz w:val="19"/>
               </w:rPr>
-              <w:t>You hand your ticket over to be checked, and you never see your winnings.</w:t>
+              <w:t>You hand over your ticket and never see the winnings.</w:t>
+            </w:r>
+          </w:p>
+        </w:tc>
+        <w:tc>
+          <w:tcPr>
+            <w:tcW w:type="dxa" w:w="1440"/>
+          </w:tcPr>
+          <w:p>
+            <w:pPr>
+              <w:spacing w:after="40"/>
+            </w:pPr>
+            <w:r>
+              <w:rPr>
+                <w:sz w:val="19"/>
+              </w:rPr>
+              <w:t>🔥 252K · 255K</w:t>
             </w:r>
           </w:p>
         </w:tc>
@@ -211,13 +225,13 @@
               <w:rPr>
                 <w:sz w:val="19"/>
               </w:rPr>
-              <w:t>🔥 YouTube 252K (WKMG) · 255K (WPLG)</w:t>
+              <w:t>F2 A (rec.)</w:t>
             </w:r>
           </w:p>
         </w:tc>
         <w:tc>
           <w:tcPr>
-            <w:tcW w:type="dxa" w:w="1656"/>
+            <w:tcW w:type="dxa" w:w="1296"/>
           </w:tcPr>
           <w:p>
             <w:pPr>
@@ -227,7 +241,74 @@
               <w:rPr>
                 <w:sz w:val="19"/>
               </w:rPr>
-              <w:t>F2 A (recommended)</w:t>
+              <w:t>HIGH</w:t>
+            </w:r>
+          </w:p>
+        </w:tc>
+      </w:tr>
+      <w:tr>
+        <w:tc>
+          <w:tcPr>
+            <w:tcW w:type="dxa" w:w="432"/>
+          </w:tcPr>
+          <w:p>
+            <w:pPr>
+              <w:spacing w:after="40"/>
+            </w:pPr>
+            <w:r>
+              <w:rPr>
+                <w:sz w:val="19"/>
+              </w:rPr>
+              <w:t>2</w:t>
+            </w:r>
+          </w:p>
+        </w:tc>
+        <w:tc>
+          <w:tcPr>
+            <w:tcW w:type="dxa" w:w="1800"/>
+          </w:tcPr>
+          <w:p>
+            <w:pPr>
+              <w:spacing w:after="40"/>
+            </w:pPr>
+            <w:r>
+              <w:rPr>
+                <w:b/>
+                <w:sz w:val="19"/>
+              </w:rPr>
+              <w:t>TV LISTENING</w:t>
+            </w:r>
+          </w:p>
+        </w:tc>
+        <w:tc>
+          <w:tcPr>
+            <w:tcW w:type="dxa" w:w="3744"/>
+          </w:tcPr>
+          <w:p>
+            <w:pPr>
+              <w:spacing w:after="40"/>
+            </w:pPr>
+            <w:r>
+              <w:rPr>
+                <w:sz w:val="19"/>
+              </w:rPr>
+              <w:t>Your TV watches what you watch, and may be listening.</w:t>
+            </w:r>
+          </w:p>
+        </w:tc>
+        <w:tc>
+          <w:tcPr>
+            <w:tcW w:type="dxa" w:w="1440"/>
+          </w:tcPr>
+          <w:p>
+            <w:pPr>
+              <w:spacing w:after="40"/>
+            </w:pPr>
+            <w:r>
+              <w:rPr>
+                <w:sz w:val="19"/>
+              </w:rPr>
+              <w:t>🔥 8.1M · 1.07M</w:t>
             </w:r>
           </w:p>
         </w:tc>
@@ -243,15 +324,13 @@
               <w:rPr>
                 <w:sz w:val="19"/>
               </w:rPr>
-              <w:t>HIGH — Powerball run is the peg</w:t>
+              <w:t>F1 lead (rec.)</w:t>
             </w:r>
           </w:p>
         </w:tc>
-      </w:tr>
-      <w:tr>
         <w:tc>
           <w:tcPr>
-            <w:tcW w:type="dxa" w:w="504"/>
+            <w:tcW w:type="dxa" w:w="1296"/>
           </w:tcPr>
           <w:p>
             <w:pPr>
@@ -261,13 +340,31 @@
               <w:rPr>
                 <w:sz w:val="19"/>
               </w:rPr>
-              <w:t>2</w:t>
+              <w:t>HIGH — 3rd TV video</w:t>
+            </w:r>
+          </w:p>
+        </w:tc>
+      </w:tr>
+      <w:tr>
+        <w:tc>
+          <w:tcPr>
+            <w:tcW w:type="dxa" w:w="432"/>
+          </w:tcPr>
+          <w:p>
+            <w:pPr>
+              <w:spacing w:after="40"/>
+            </w:pPr>
+            <w:r>
+              <w:rPr>
+                <w:sz w:val="19"/>
+              </w:rPr>
+              <w:t>3</w:t>
             </w:r>
           </w:p>
         </w:tc>
         <w:tc>
           <w:tcPr>
-            <w:tcW w:type="dxa" w:w="2088"/>
+            <w:tcW w:type="dxa" w:w="1800"/>
           </w:tcPr>
           <w:p>
             <w:pPr>
@@ -278,13 +375,13 @@
                 <w:b/>
                 <w:sz w:val="19"/>
               </w:rPr>
-              <w:t>YOUR TV IS LISTENING — EVEN WHEN IT'S OFF</w:t>
+              <w:t>$2 WATER, $2,400 GONE</w:t>
             </w:r>
           </w:p>
         </w:tc>
         <w:tc>
           <w:tcPr>
-            <w:tcW w:type="dxa" w:w="3384"/>
+            <w:tcW w:type="dxa" w:w="3744"/>
           </w:tcPr>
           <w:p>
             <w:pPr>
@@ -294,7 +391,23 @@
               <w:rPr>
                 <w:sz w:val="19"/>
               </w:rPr>
-              <w:t>The TV in your bedroom watches what you watch, and researchers say it may be listening.</w:t>
+              <w:t>Ten seconds with your phone, and the bank says it's your fault.</w:t>
+            </w:r>
+          </w:p>
+        </w:tc>
+        <w:tc>
+          <w:tcPr>
+            <w:tcW w:type="dxa" w:w="1440"/>
+          </w:tcPr>
+          <w:p>
+            <w:pPr>
+              <w:spacing w:after="40"/>
+            </w:pPr>
+            <w:r>
+              <w:rPr>
+                <w:sz w:val="19"/>
+              </w:rPr>
+              <w:t>🔥 72K in 5 days · 3.1M</w:t>
             </w:r>
           </w:p>
         </w:tc>
@@ -310,13 +423,13 @@
               <w:rPr>
                 <w:sz w:val="19"/>
               </w:rPr>
-              <w:t>🔥 YouTube 8.1M (Gamers Nexus) · 1.07M (She Prepares)</w:t>
+              <w:t>F1 B / F2 A</w:t>
             </w:r>
           </w:p>
         </w:tc>
         <w:tc>
           <w:tcPr>
-            <w:tcW w:type="dxa" w:w="1656"/>
+            <w:tcW w:type="dxa" w:w="1296"/>
           </w:tcPr>
           <w:p>
             <w:pPr>
@@ -326,7 +439,74 @@
               <w:rPr>
                 <w:sz w:val="19"/>
               </w:rPr>
-              <w:t>F1 lead (recommended)</w:t>
+              <w:t>MEDIUM</w:t>
+            </w:r>
+          </w:p>
+        </w:tc>
+      </w:tr>
+      <w:tr>
+        <w:tc>
+          <w:tcPr>
+            <w:tcW w:type="dxa" w:w="432"/>
+          </w:tcPr>
+          <w:p>
+            <w:pPr>
+              <w:spacing w:after="40"/>
+            </w:pPr>
+            <w:r>
+              <w:rPr>
+                <w:sz w:val="19"/>
+              </w:rPr>
+              <w:t>4</w:t>
+            </w:r>
+          </w:p>
+        </w:tc>
+        <w:tc>
+          <w:tcPr>
+            <w:tcW w:type="dxa" w:w="1800"/>
+          </w:tcPr>
+          <w:p>
+            <w:pPr>
+              <w:spacing w:after="40"/>
+            </w:pPr>
+            <w:r>
+              <w:rPr>
+                <w:b/>
+                <w:sz w:val="19"/>
+              </w:rPr>
+              <w:t>BANK TELLER</w:t>
+            </w:r>
+          </w:p>
+        </w:tc>
+        <w:tc>
+          <w:tcPr>
+            <w:tcW w:type="dxa" w:w="3744"/>
+          </w:tcPr>
+          <w:p>
+            <w:pPr>
+              <w:spacing w:after="40"/>
+            </w:pPr>
+            <w:r>
+              <w:rPr>
+                <w:sz w:val="19"/>
+              </w:rPr>
+              <w:t>The friendly teller is the one draining you.</w:t>
+            </w:r>
+          </w:p>
+        </w:tc>
+        <w:tc>
+          <w:tcPr>
+            <w:tcW w:type="dxa" w:w="1440"/>
+          </w:tcPr>
+          <w:p>
+            <w:pPr>
+              <w:spacing w:after="40"/>
+            </w:pPr>
+            <w:r>
+              <w:rPr>
+                <w:sz w:val="19"/>
+              </w:rPr>
+              <w:t>🔥 432K</w:t>
             </w:r>
           </w:p>
         </w:tc>
@@ -342,15 +522,13 @@
               <w:rPr>
                 <w:sz w:val="19"/>
               </w:rPr>
-              <w:t>HIGH — our third TV video; listening claim disputed</w:t>
+              <w:t>F1 B / F2 A</w:t>
             </w:r>
           </w:p>
         </w:tc>
-      </w:tr>
-      <w:tr>
         <w:tc>
           <w:tcPr>
-            <w:tcW w:type="dxa" w:w="504"/>
+            <w:tcW w:type="dxa" w:w="1296"/>
           </w:tcPr>
           <w:p>
             <w:pPr>
@@ -360,13 +538,31 @@
               <w:rPr>
                 <w:sz w:val="19"/>
               </w:rPr>
-              <w:t>3</w:t>
+              <w:t>MEDIUM</w:t>
+            </w:r>
+          </w:p>
+        </w:tc>
+      </w:tr>
+      <w:tr>
+        <w:tc>
+          <w:tcPr>
+            <w:tcW w:type="dxa" w:w="432"/>
+          </w:tcPr>
+          <w:p>
+            <w:pPr>
+              <w:spacing w:after="40"/>
+            </w:pPr>
+            <w:r>
+              <w:rPr>
+                <w:sz w:val="19"/>
+              </w:rPr>
+              <w:t>5</w:t>
             </w:r>
           </w:p>
         </w:tc>
         <w:tc>
           <w:tcPr>
-            <w:tcW w:type="dxa" w:w="2088"/>
+            <w:tcW w:type="dxa" w:w="1800"/>
           </w:tcPr>
           <w:p>
             <w:pPr>
@@ -377,13 +573,13 @@
                 <w:b/>
                 <w:sz w:val="19"/>
               </w:rPr>
-              <w:t>SHE PAID $2 FOR WATER — THEN LOST $2,400</w:t>
+              <w:t>FAKE CELEBRITY</w:t>
             </w:r>
           </w:p>
         </w:tc>
         <w:tc>
           <w:tcPr>
-            <w:tcW w:type="dxa" w:w="3384"/>
+            <w:tcW w:type="dxa" w:w="3744"/>
           </w:tcPr>
           <w:p>
             <w:pPr>
@@ -393,7 +589,23 @@
               <w:rPr>
                 <w:sz w:val="19"/>
               </w:rPr>
-              <w:t>A stranger gets ten seconds with your phone, and your bank says it's your fault.</w:t>
+              <w:t>A "star" on Facebook wants your savings.</w:t>
+            </w:r>
+          </w:p>
+        </w:tc>
+        <w:tc>
+          <w:tcPr>
+            <w:tcW w:type="dxa" w:w="1440"/>
+          </w:tcPr>
+          <w:p>
+            <w:pPr>
+              <w:spacing w:after="40"/>
+            </w:pPr>
+            <w:r>
+              <w:rPr>
+                <w:sz w:val="19"/>
+              </w:rPr>
+              <w:t>🔥 585K · 296K</w:t>
             </w:r>
           </w:p>
         </w:tc>
@@ -409,13 +621,13 @@
               <w:rPr>
                 <w:sz w:val="19"/>
               </w:rPr>
-              <w:t>🔥 YouTube 72K in 5 days (11Alive) · 3.1M (phone-store bodycam)</w:t>
+              <w:t>F2 alt. A</w:t>
             </w:r>
           </w:p>
         </w:tc>
         <w:tc>
           <w:tcPr>
-            <w:tcW w:type="dxa" w:w="1656"/>
+            <w:tcW w:type="dxa" w:w="1296"/>
           </w:tcPr>
           <w:p>
             <w:pPr>
@@ -425,7 +637,74 @@
               <w:rPr>
                 <w:sz w:val="19"/>
               </w:rPr>
-              <w:t>F1 B, or F2 A</w:t>
+              <w:t>MEDIUM</w:t>
+            </w:r>
+          </w:p>
+        </w:tc>
+      </w:tr>
+      <w:tr>
+        <w:tc>
+          <w:tcPr>
+            <w:tcW w:type="dxa" w:w="432"/>
+          </w:tcPr>
+          <w:p>
+            <w:pPr>
+              <w:spacing w:after="40"/>
+            </w:pPr>
+            <w:r>
+              <w:rPr>
+                <w:sz w:val="19"/>
+              </w:rPr>
+              <w:t>6</w:t>
+            </w:r>
+          </w:p>
+        </w:tc>
+        <w:tc>
+          <w:tcPr>
+            <w:tcW w:type="dxa" w:w="1800"/>
+          </w:tcPr>
+          <w:p>
+            <w:pPr>
+              <w:spacing w:after="40"/>
+            </w:pPr>
+            <w:r>
+              <w:rPr>
+                <w:b/>
+                <w:sz w:val="19"/>
+              </w:rPr>
+              <w:t>RENTAL DAMAGE</w:t>
+            </w:r>
+          </w:p>
+        </w:tc>
+        <w:tc>
+          <w:tcPr>
+            <w:tcW w:type="dxa" w:w="3744"/>
+          </w:tcPr>
+          <w:p>
+            <w:pPr>
+              <w:spacing w:after="40"/>
+            </w:pPr>
+            <w:r>
+              <w:rPr>
+                <w:sz w:val="19"/>
+              </w:rPr>
+              <w:t>The damage bill arrives weeks later. The photo is fake.</w:t>
+            </w:r>
+          </w:p>
+        </w:tc>
+        <w:tc>
+          <w:tcPr>
+            <w:tcW w:type="dxa" w:w="1440"/>
+          </w:tcPr>
+          <w:p>
+            <w:pPr>
+              <w:spacing w:after="40"/>
+            </w:pPr>
+            <w:r>
+              <w:rPr>
+                <w:sz w:val="19"/>
+              </w:rPr>
+              <w:t>🔥 547K in 5 days</w:t>
             </w:r>
           </w:p>
         </w:tc>
@@ -441,15 +720,13 @@
               <w:rPr>
                 <w:sz w:val="19"/>
               </w:rPr>
-              <w:t>MEDIUM — fresh and hot; QR angle aired 5/27</w:t>
+              <w:t>F2 A/B · holidays</w:t>
             </w:r>
           </w:p>
         </w:tc>
-      </w:tr>
-      <w:tr>
         <w:tc>
           <w:tcPr>
-            <w:tcW w:type="dxa" w:w="504"/>
+            <w:tcW w:type="dxa" w:w="1296"/>
           </w:tcPr>
           <w:p>
             <w:pPr>
@@ -459,13 +736,31 @@
               <w:rPr>
                 <w:sz w:val="19"/>
               </w:rPr>
-              <w:t>4</w:t>
+              <w:t>MEDIUM — travel lags</w:t>
+            </w:r>
+          </w:p>
+        </w:tc>
+      </w:tr>
+      <w:tr>
+        <w:tc>
+          <w:tcPr>
+            <w:tcW w:type="dxa" w:w="432"/>
+          </w:tcPr>
+          <w:p>
+            <w:pPr>
+              <w:spacing w:after="40"/>
+            </w:pPr>
+            <w:r>
+              <w:rPr>
+                <w:sz w:val="19"/>
+              </w:rPr>
+              <w:t>7</w:t>
             </w:r>
           </w:p>
         </w:tc>
         <w:tc>
           <w:tcPr>
-            <w:tcW w:type="dxa" w:w="2088"/>
+            <w:tcW w:type="dxa" w:w="1800"/>
           </w:tcPr>
           <w:p>
             <w:pPr>
@@ -476,13 +771,13 @@
                 <w:b/>
                 <w:sz w:val="19"/>
               </w:rPr>
-              <w:t>THE BANK TELLER WAS EMPTYING HER ACCOUNT</w:t>
+              <w:t>HUG SCAM</w:t>
             </w:r>
           </w:p>
         </w:tc>
         <w:tc>
           <w:tcPr>
-            <w:tcW w:type="dxa" w:w="3384"/>
+            <w:tcW w:type="dxa" w:w="3744"/>
           </w:tcPr>
           <w:p>
             <w:pPr>
@@ -492,7 +787,23 @@
               <w:rPr>
                 <w:sz w:val="19"/>
               </w:rPr>
-              <w:t>The friendly employee at the counter is the one draining your money.</w:t>
+              <w:t>A hug, a "gift" necklace, and your gold is gone.</w:t>
+            </w:r>
+          </w:p>
+        </w:tc>
+        <w:tc>
+          <w:tcPr>
+            <w:tcW w:type="dxa" w:w="1440"/>
+          </w:tcPr>
+          <w:p>
+            <w:pPr>
+              <w:spacing w:after="40"/>
+            </w:pPr>
+            <w:r>
+              <w:rPr>
+                <w:sz w:val="19"/>
+              </w:rPr>
+              <w:t>🔥 1.1M (Canada) · 447K</w:t>
             </w:r>
           </w:p>
         </w:tc>
@@ -508,13 +819,13 @@
               <w:rPr>
                 <w:sz w:val="19"/>
               </w:rPr>
-              <w:t>🔥 YouTube 432K (PNC teller bodycam)</w:t>
+              <w:t>F2 B</w:t>
             </w:r>
           </w:p>
         </w:tc>
         <w:tc>
           <w:tcPr>
-            <w:tcW w:type="dxa" w:w="1656"/>
+            <w:tcW w:type="dxa" w:w="1296"/>
           </w:tcPr>
           <w:p>
             <w:pPr>
@@ -524,7 +835,74 @@
               <w:rPr>
                 <w:sz w:val="19"/>
               </w:rPr>
-              <w:t>F1 B, or F2 A</w:t>
+              <w:t>MEDIUM</w:t>
+            </w:r>
+          </w:p>
+        </w:tc>
+      </w:tr>
+      <w:tr>
+        <w:tc>
+          <w:tcPr>
+            <w:tcW w:type="dxa" w:w="432"/>
+          </w:tcPr>
+          <w:p>
+            <w:pPr>
+              <w:spacing w:after="40"/>
+            </w:pPr>
+            <w:r>
+              <w:rPr>
+                <w:sz w:val="19"/>
+              </w:rPr>
+              <w:t>8</w:t>
+            </w:r>
+          </w:p>
+        </w:tc>
+        <w:tc>
+          <w:tcPr>
+            <w:tcW w:type="dxa" w:w="1800"/>
+          </w:tcPr>
+          <w:p>
+            <w:pPr>
+              <w:spacing w:after="40"/>
+            </w:pPr>
+            <w:r>
+              <w:rPr>
+                <w:b/>
+                <w:sz w:val="19"/>
+              </w:rPr>
+              <w:t>WINTER BILL CALL</w:t>
+            </w:r>
+          </w:p>
+        </w:tc>
+        <w:tc>
+          <w:tcPr>
+            <w:tcW w:type="dxa" w:w="3744"/>
+          </w:tcPr>
+          <w:p>
+            <w:pPr>
+              <w:spacing w:after="40"/>
+            </w:pPr>
+            <w:r>
+              <w:rPr>
+                <w:sz w:val="19"/>
+              </w:rPr>
+              <w:t>A caller "protects" your rate, and it nearly doubles.</w:t>
+            </w:r>
+          </w:p>
+        </w:tc>
+        <w:tc>
+          <w:tcPr>
+            <w:tcW w:type="dxa" w:w="1440"/>
+          </w:tcPr>
+          <w:p>
+            <w:pPr>
+              <w:spacing w:after="40"/>
+            </w:pPr>
+            <w:r>
+              <w:rPr>
+                <w:sz w:val="19"/>
+              </w:rPr>
+              <w:t>🔥 1.83M · 730K</w:t>
             </w:r>
           </w:p>
         </w:tc>
@@ -540,15 +918,13 @@
               <w:rPr>
                 <w:sz w:val="19"/>
               </w:rPr>
-              <w:t>MEDIUM — cases span 2023–2026</w:t>
+              <w:t>F1 lead/B</w:t>
             </w:r>
           </w:p>
         </w:tc>
-      </w:tr>
-      <w:tr>
         <w:tc>
           <w:tcPr>
-            <w:tcW w:type="dxa" w:w="504"/>
+            <w:tcW w:type="dxa" w:w="1296"/>
           </w:tcPr>
           <w:p>
             <w:pPr>
@@ -558,13 +934,31 @@
               <w:rPr>
                 <w:sz w:val="19"/>
               </w:rPr>
-              <w:t>5</w:t>
+              <w:t>MEDIUM</w:t>
+            </w:r>
+          </w:p>
+        </w:tc>
+      </w:tr>
+      <w:tr>
+        <w:tc>
+          <w:tcPr>
+            <w:tcW w:type="dxa" w:w="432"/>
+          </w:tcPr>
+          <w:p>
+            <w:pPr>
+              <w:spacing w:after="40"/>
+            </w:pPr>
+            <w:r>
+              <w:rPr>
+                <w:sz w:val="19"/>
+              </w:rPr>
+              <w:t>9</w:t>
             </w:r>
           </w:p>
         </w:tc>
         <w:tc>
           <w:tcPr>
-            <w:tcW w:type="dxa" w:w="2088"/>
+            <w:tcW w:type="dxa" w:w="1800"/>
           </w:tcPr>
           <w:p>
             <w:pPr>
@@ -575,13 +969,13 @@
                 <w:b/>
                 <w:sz w:val="19"/>
               </w:rPr>
-              <w:t>A CELEBRITY MESSAGED HER — IT COST HER $81,000</w:t>
+              <w:t>PHARMACY PRICE</w:t>
             </w:r>
           </w:p>
         </w:tc>
         <w:tc>
           <w:tcPr>
-            <w:tcW w:type="dxa" w:w="3384"/>
+            <w:tcW w:type="dxa" w:w="3744"/>
           </w:tcPr>
           <w:p>
             <w:pPr>
@@ -591,7 +985,23 @@
               <w:rPr>
                 <w:sz w:val="19"/>
               </w:rPr>
-              <w:t>A "star" writes to you on Facebook, and he wants your savings.</w:t>
+              <w:t>The cheaper price exists. Nobody has to tell you.</w:t>
+            </w:r>
+          </w:p>
+        </w:tc>
+        <w:tc>
+          <w:tcPr>
+            <w:tcW w:type="dxa" w:w="1440"/>
+          </w:tcPr>
+          <w:p>
+            <w:pPr>
+              <w:spacing w:after="40"/>
+            </w:pPr>
+            <w:r>
+              <w:rPr>
+                <w:sz w:val="19"/>
+              </w:rPr>
+              <w:t>—</w:t>
             </w:r>
           </w:p>
         </w:tc>
@@ -607,13 +1017,13 @@
               <w:rPr>
                 <w:sz w:val="19"/>
               </w:rPr>
-              <w:t>🔥 YouTube 585K (Inside Edition) · 296K (KTLA)</w:t>
+              <w:t>F1 B (demo)</w:t>
             </w:r>
           </w:p>
         </w:tc>
         <w:tc>
           <w:tcPr>
-            <w:tcW w:type="dxa" w:w="1656"/>
+            <w:tcW w:type="dxa" w:w="1296"/>
           </w:tcPr>
           <w:p>
             <w:pPr>
@@ -623,7 +1033,74 @@
               <w:rPr>
                 <w:sz w:val="19"/>
               </w:rPr>
-              <w:t>F2 A (alternate)</w:t>
+              <w:t>MEDIUM</w:t>
+            </w:r>
+          </w:p>
+        </w:tc>
+      </w:tr>
+      <w:tr>
+        <w:tc>
+          <w:tcPr>
+            <w:tcW w:type="dxa" w:w="432"/>
+          </w:tcPr>
+          <w:p>
+            <w:pPr>
+              <w:spacing w:after="40"/>
+            </w:pPr>
+            <w:r>
+              <w:rPr>
+                <w:sz w:val="19"/>
+              </w:rPr>
+              <w:t>10</w:t>
+            </w:r>
+          </w:p>
+        </w:tc>
+        <w:tc>
+          <w:tcPr>
+            <w:tcW w:type="dxa" w:w="1800"/>
+          </w:tcPr>
+          <w:p>
+            <w:pPr>
+              <w:spacing w:after="40"/>
+            </w:pPr>
+            <w:r>
+              <w:rPr>
+                <w:b/>
+                <w:sz w:val="19"/>
+              </w:rPr>
+              <w:t>WALMART TAGS</w:t>
+            </w:r>
+          </w:p>
+        </w:tc>
+        <w:tc>
+          <w:tcPr>
+            <w:tcW w:type="dxa" w:w="3744"/>
+          </w:tcPr>
+          <w:p>
+            <w:pPr>
+              <w:spacing w:after="40"/>
+            </w:pPr>
+            <w:r>
+              <w:rPr>
+                <w:sz w:val="19"/>
+              </w:rPr>
+              <w:t>Their patents describe pricing you, not the product.</w:t>
+            </w:r>
+          </w:p>
+        </w:tc>
+        <w:tc>
+          <w:tcPr>
+            <w:tcW w:type="dxa" w:w="1440"/>
+          </w:tcPr>
+          <w:p>
+            <w:pPr>
+              <w:spacing w:after="40"/>
+            </w:pPr>
+            <w:r>
+              <w:rPr>
+                <w:sz w:val="19"/>
+              </w:rPr>
+              <w:t>🔥 3.3M · 588K</w:t>
             </w:r>
           </w:p>
         </w:tc>
@@ -639,15 +1116,13 @@
               <w:rPr>
                 <w:sz w:val="19"/>
               </w:rPr>
-              <w:t>MEDIUM — best 55+ victim is from May</w:t>
+              <w:t>F1 B</w:t>
             </w:r>
           </w:p>
         </w:tc>
-      </w:tr>
-      <w:tr>
         <w:tc>
           <w:tcPr>
-            <w:tcW w:type="dxa" w:w="504"/>
+            <w:tcW w:type="dxa" w:w="1296"/>
           </w:tcPr>
           <w:p>
             <w:pPr>
@@ -657,13 +1132,31 @@
               <w:rPr>
                 <w:sz w:val="19"/>
               </w:rPr>
-              <w:t>6</w:t>
+              <w:t>MEDIUM — repeat</w:t>
+            </w:r>
+          </w:p>
+        </w:tc>
+      </w:tr>
+      <w:tr>
+        <w:tc>
+          <w:tcPr>
+            <w:tcW w:type="dxa" w:w="432"/>
+          </w:tcPr>
+          <w:p>
+            <w:pPr>
+              <w:spacing w:after="40"/>
+            </w:pPr>
+            <w:r>
+              <w:rPr>
+                <w:sz w:val="19"/>
+              </w:rPr>
+              <w:t>11</w:t>
             </w:r>
           </w:p>
         </w:tc>
         <w:tc>
           <w:tcPr>
-            <w:tcW w:type="dxa" w:w="2088"/>
+            <w:tcW w:type="dxa" w:w="1800"/>
           </w:tcPr>
           <w:p>
             <w:pPr>
@@ -674,13 +1167,13 @@
                 <w:b/>
                 <w:sz w:val="19"/>
               </w:rPr>
-              <w:t>THEY'RE BILLING YOU FOR DAMAGE YOU DIDN'T DO</w:t>
+              <w:t>REAL ARREST, FAKE BAIL</w:t>
             </w:r>
           </w:p>
         </w:tc>
         <w:tc>
           <w:tcPr>
-            <w:tcW w:type="dxa" w:w="3384"/>
+            <w:tcW w:type="dxa" w:w="3744"/>
           </w:tcPr>
           <w:p>
             <w:pPr>
@@ -690,7 +1183,23 @@
               <w:rPr>
                 <w:sz w:val="19"/>
               </w:rPr>
-              <w:t>Weeks after your trip, a damage bill arrives, and the "proof" photo is fake.</w:t>
+              <w:t>The arrest is real, so the scam checks out.</w:t>
+            </w:r>
+          </w:p>
+        </w:tc>
+        <w:tc>
+          <w:tcPr>
+            <w:tcW w:type="dxa" w:w="1440"/>
+          </w:tcPr>
+          <w:p>
+            <w:pPr>
+              <w:spacing w:after="40"/>
+            </w:pPr>
+            <w:r>
+              <w:rPr>
+                <w:sz w:val="19"/>
+              </w:rPr>
+              <w:t>—</w:t>
             </w:r>
           </w:p>
         </w:tc>
@@ -706,13 +1215,13 @@
               <w:rPr>
                 <w:sz w:val="19"/>
               </w:rPr>
-              <w:t>🔥 YouTube 547K in 5 days (KSL) · 234K (CBS Chicago)</w:t>
+              <w:t>F2 B</w:t>
             </w:r>
           </w:p>
         </w:tc>
         <w:tc>
           <w:tcPr>
-            <w:tcW w:type="dxa" w:w="1656"/>
+            <w:tcW w:type="dxa" w:w="1296"/>
           </w:tcPr>
           <w:p>
             <w:pPr>
@@ -722,7 +1231,74 @@
               <w:rPr>
                 <w:sz w:val="19"/>
               </w:rPr>
-              <w:t>F2 A or B · TIME-SENSITIVE (holiday travel)</w:t>
+              <w:t>MEDIUM</w:t>
+            </w:r>
+          </w:p>
+        </w:tc>
+      </w:tr>
+      <w:tr>
+        <w:tc>
+          <w:tcPr>
+            <w:tcW w:type="dxa" w:w="432"/>
+          </w:tcPr>
+          <w:p>
+            <w:pPr>
+              <w:spacing w:after="40"/>
+            </w:pPr>
+            <w:r>
+              <w:rPr>
+                <w:sz w:val="19"/>
+              </w:rPr>
+              <w:t>12</w:t>
+            </w:r>
+          </w:p>
+        </w:tc>
+        <w:tc>
+          <w:tcPr>
+            <w:tcW w:type="dxa" w:w="1800"/>
+          </w:tcPr>
+          <w:p>
+            <w:pPr>
+              <w:spacing w:after="40"/>
+            </w:pPr>
+            <w:r>
+              <w:rPr>
+                <w:b/>
+                <w:sz w:val="19"/>
+              </w:rPr>
+              <w:t>CELL TOWERS</w:t>
+            </w:r>
+          </w:p>
+        </w:tc>
+        <w:tc>
+          <w:tcPr>
+            <w:tcW w:type="dxa" w:w="3744"/>
+          </w:tcPr>
+          <w:p>
+            <w:pPr>
+              <w:spacing w:after="40"/>
+            </w:pPr>
+            <w:r>
+              <w:rPr>
+                <w:sz w:val="19"/>
+              </w:rPr>
+              <w:t>Same network, cheaper name.</w:t>
+            </w:r>
+          </w:p>
+        </w:tc>
+        <w:tc>
+          <w:tcPr>
+            <w:tcW w:type="dxa" w:w="1440"/>
+          </w:tcPr>
+          <w:p>
+            <w:pPr>
+              <w:spacing w:after="40"/>
+            </w:pPr>
+            <w:r>
+              <w:rPr>
+                <w:sz w:val="19"/>
+              </w:rPr>
+              <w:t>—</w:t>
             </w:r>
           </w:p>
         </w:tc>
@@ -738,15 +1314,13 @@
               <w:rPr>
                 <w:sz w:val="19"/>
               </w:rPr>
-              <w:t>MEDIUM — travel lags for us</w:t>
+              <w:t>F1 C</w:t>
             </w:r>
           </w:p>
         </w:tc>
-      </w:tr>
-      <w:tr>
         <w:tc>
           <w:tcPr>
-            <w:tcW w:type="dxa" w:w="504"/>
+            <w:tcW w:type="dxa" w:w="1296"/>
           </w:tcPr>
           <w:p>
             <w:pPr>
@@ -756,583 +1330,7 @@
               <w:rPr>
                 <w:sz w:val="19"/>
               </w:rPr>
-              <w:t>7</w:t>
-            </w:r>
-          </w:p>
-        </w:tc>
-        <w:tc>
-          <w:tcPr>
-            <w:tcW w:type="dxa" w:w="2088"/>
-          </w:tcPr>
-          <w:p>
-            <w:pPr>
-              <w:spacing w:after="40"/>
-            </w:pPr>
-            <w:r>
-              <w:rPr>
-                <w:b/>
-                <w:sz w:val="19"/>
-              </w:rPr>
-              <w:t>THE STRANGER WHO HUGGED HER STOLE HER GOLD</w:t>
-            </w:r>
-          </w:p>
-        </w:tc>
-        <w:tc>
-          <w:tcPr>
-            <w:tcW w:type="dxa" w:w="3384"/>
-          </w:tcPr>
-          <w:p>
-            <w:pPr>
-              <w:spacing w:after="40"/>
-            </w:pPr>
-            <w:r>
-              <w:rPr>
-                <w:sz w:val="19"/>
-              </w:rPr>
-              <w:t>A friendly hug, a "gift" necklace, and your real gold is gone.</w:t>
-            </w:r>
-          </w:p>
-        </w:tc>
-        <w:tc>
-          <w:tcPr>
-            <w:tcW w:type="dxa" w:w="1224"/>
-          </w:tcPr>
-          <w:p>
-            <w:pPr>
-              <w:spacing w:after="40"/>
-            </w:pPr>
-            <w:r>
-              <w:rPr>
-                <w:sz w:val="19"/>
-              </w:rPr>
-              <w:t>🔥 YouTube 1.1M (NDTV, Canada) · 447K (FOX 13 Seattle)</w:t>
-            </w:r>
-          </w:p>
-        </w:tc>
-        <w:tc>
-          <w:tcPr>
-            <w:tcW w:type="dxa" w:w="1656"/>
-          </w:tcPr>
-          <w:p>
-            <w:pPr>
-              <w:spacing w:after="40"/>
-            </w:pPr>
-            <w:r>
-              <w:rPr>
-                <w:sz w:val="19"/>
-              </w:rPr>
-              <w:t>F2 B, A in a pinch</w:t>
-            </w:r>
-          </w:p>
-        </w:tc>
-        <w:tc>
-          <w:tcPr>
-            <w:tcW w:type="dxa" w:w="1224"/>
-          </w:tcPr>
-          <w:p>
-            <w:pPr>
-              <w:spacing w:after="40"/>
-            </w:pPr>
-            <w:r>
-              <w:rPr>
-                <w:sz w:val="19"/>
-              </w:rPr>
-              <w:t>MEDIUM — small US losses</w:t>
-            </w:r>
-          </w:p>
-        </w:tc>
-      </w:tr>
-      <w:tr>
-        <w:tc>
-          <w:tcPr>
-            <w:tcW w:type="dxa" w:w="504"/>
-          </w:tcPr>
-          <w:p>
-            <w:pPr>
-              <w:spacing w:after="40"/>
-            </w:pPr>
-            <w:r>
-              <w:rPr>
-                <w:sz w:val="19"/>
-              </w:rPr>
-              <w:t>8</w:t>
-            </w:r>
-          </w:p>
-        </w:tc>
-        <w:tc>
-          <w:tcPr>
-            <w:tcW w:type="dxa" w:w="2088"/>
-          </w:tcPr>
-          <w:p>
-            <w:pPr>
-              <w:spacing w:after="40"/>
-            </w:pPr>
-            <w:r>
-              <w:rPr>
-                <w:b/>
-                <w:sz w:val="19"/>
-              </w:rPr>
-              <w:t>WINTER BILLS ARE GOING UP — AND THIS ONE CALL CAN DOUBLE YOURS</w:t>
-            </w:r>
-          </w:p>
-        </w:tc>
-        <w:tc>
-          <w:tcPr>
-            <w:tcW w:type="dxa" w:w="3384"/>
-          </w:tcPr>
-          <w:p>
-            <w:pPr>
-              <w:spacing w:after="40"/>
-            </w:pPr>
-            <w:r>
-              <w:rPr>
-                <w:sz w:val="19"/>
-              </w:rPr>
-              <w:t>A caller offers to "protect" your rate. Your rate nearly doubles.</w:t>
-            </w:r>
-          </w:p>
-        </w:tc>
-        <w:tc>
-          <w:tcPr>
-            <w:tcW w:type="dxa" w:w="1224"/>
-          </w:tcPr>
-          <w:p>
-            <w:pPr>
-              <w:spacing w:after="40"/>
-            </w:pPr>
-            <w:r>
-              <w:rPr>
-                <w:sz w:val="19"/>
-              </w:rPr>
-              <w:t>🔥 YouTube 1.83M (60 Minutes) · 730K (Climate Town)</w:t>
-            </w:r>
-          </w:p>
-        </w:tc>
-        <w:tc>
-          <w:tcPr>
-            <w:tcW w:type="dxa" w:w="1656"/>
-          </w:tcPr>
-          <w:p>
-            <w:pPr>
-              <w:spacing w:after="40"/>
-            </w:pPr>
-            <w:r>
-              <w:rPr>
-                <w:sz w:val="19"/>
-              </w:rPr>
-              <w:t>F1 lead or B · TIME-SENSITIVE</w:t>
-            </w:r>
-          </w:p>
-        </w:tc>
-        <w:tc>
-          <w:tcPr>
-            <w:tcW w:type="dxa" w:w="1224"/>
-          </w:tcPr>
-          <w:p>
-            <w:pPr>
-              <w:spacing w:after="40"/>
-            </w:pPr>
-            <w:r>
-              <w:rPr>
-                <w:sz w:val="19"/>
-              </w:rPr>
-              <w:t>MEDIUM — no 55+ victim yet</w:t>
-            </w:r>
-          </w:p>
-        </w:tc>
-      </w:tr>
-      <w:tr>
-        <w:tc>
-          <w:tcPr>
-            <w:tcW w:type="dxa" w:w="504"/>
-          </w:tcPr>
-          <w:p>
-            <w:pPr>
-              <w:spacing w:after="40"/>
-            </w:pPr>
-            <w:r>
-              <w:rPr>
-                <w:sz w:val="19"/>
-              </w:rPr>
-              <w:t>9</w:t>
-            </w:r>
-          </w:p>
-        </w:tc>
-        <w:tc>
-          <w:tcPr>
-            <w:tcW w:type="dxa" w:w="2088"/>
-          </w:tcPr>
-          <w:p>
-            <w:pPr>
-              <w:spacing w:after="40"/>
-            </w:pPr>
-            <w:r>
-              <w:rPr>
-                <w:b/>
-                <w:sz w:val="19"/>
-              </w:rPr>
-              <w:t>YOUR INSURANCE CARD IS COSTING YOU AT THE PHARMACY</w:t>
-            </w:r>
-          </w:p>
-        </w:tc>
-        <w:tc>
-          <w:tcPr>
-            <w:tcW w:type="dxa" w:w="3384"/>
-          </w:tcPr>
-          <w:p>
-            <w:pPr>
-              <w:spacing w:after="40"/>
-            </w:pPr>
-            <w:r>
-              <w:rPr>
-                <w:sz w:val="19"/>
-              </w:rPr>
-              <w:t>The pharmacist knows a cheaper price and doesn't have to tell you.</w:t>
-            </w:r>
-          </w:p>
-        </w:tc>
-        <w:tc>
-          <w:tcPr>
-            <w:tcW w:type="dxa" w:w="1224"/>
-          </w:tcPr>
-          <w:p>
-            <w:pPr>
-              <w:spacing w:after="40"/>
-            </w:pPr>
-            <w:r>
-              <w:rPr>
-                <w:sz w:val="19"/>
-              </w:rPr>
-              <w:t>—</w:t>
-            </w:r>
-          </w:p>
-        </w:tc>
-        <w:tc>
-          <w:tcPr>
-            <w:tcW w:type="dxa" w:w="1656"/>
-          </w:tcPr>
-          <w:p>
-            <w:pPr>
-              <w:spacing w:after="40"/>
-            </w:pPr>
-            <w:r>
-              <w:rPr>
-                <w:sz w:val="19"/>
-              </w:rPr>
-              <w:t>F1 B (Jeff at the counter)</w:t>
-            </w:r>
-          </w:p>
-        </w:tc>
-        <w:tc>
-          <w:tcPr>
-            <w:tcW w:type="dxa" w:w="1224"/>
-          </w:tcPr>
-          <w:p>
-            <w:pPr>
-              <w:spacing w:after="40"/>
-            </w:pPr>
-            <w:r>
-              <w:rPr>
-                <w:sz w:val="19"/>
-              </w:rPr>
-              <w:t>MEDIUM — no victim; needs a demo</w:t>
-            </w:r>
-          </w:p>
-        </w:tc>
-      </w:tr>
-      <w:tr>
-        <w:tc>
-          <w:tcPr>
-            <w:tcW w:type="dxa" w:w="504"/>
-          </w:tcPr>
-          <w:p>
-            <w:pPr>
-              <w:spacing w:after="40"/>
-            </w:pPr>
-            <w:r>
-              <w:rPr>
-                <w:sz w:val="19"/>
-              </w:rPr>
-              <w:t>10</w:t>
-            </w:r>
-          </w:p>
-        </w:tc>
-        <w:tc>
-          <w:tcPr>
-            <w:tcW w:type="dxa" w:w="2088"/>
-          </w:tcPr>
-          <w:p>
-            <w:pPr>
-              <w:spacing w:after="40"/>
-            </w:pPr>
-            <w:r>
-              <w:rPr>
-                <w:b/>
-                <w:sz w:val="19"/>
-              </w:rPr>
-              <w:t>WALMART'S NEW PRICE TAGS CAN CHANGE IN SECONDS</w:t>
-            </w:r>
-          </w:p>
-        </w:tc>
-        <w:tc>
-          <w:tcPr>
-            <w:tcW w:type="dxa" w:w="3384"/>
-          </w:tcPr>
-          <w:p>
-            <w:pPr>
-              <w:spacing w:after="40"/>
-            </w:pPr>
-            <w:r>
-              <w:rPr>
-                <w:sz w:val="19"/>
-              </w:rPr>
-              <w:t>The shelf price can change in seconds, and their patents describe pricing you, not the product.</w:t>
-            </w:r>
-          </w:p>
-        </w:tc>
-        <w:tc>
-          <w:tcPr>
-            <w:tcW w:type="dxa" w:w="1224"/>
-          </w:tcPr>
-          <w:p>
-            <w:pPr>
-              <w:spacing w:after="40"/>
-            </w:pPr>
-            <w:r>
-              <w:rPr>
-                <w:sz w:val="19"/>
-              </w:rPr>
-              <w:t>🔥 YouTube 3.3M (She Prepares) · 588K in 2 days (MS NOW)</w:t>
-            </w:r>
-          </w:p>
-        </w:tc>
-        <w:tc>
-          <w:tcPr>
-            <w:tcW w:type="dxa" w:w="1656"/>
-          </w:tcPr>
-          <w:p>
-            <w:pPr>
-              <w:spacing w:after="40"/>
-            </w:pPr>
-            <w:r>
-              <w:rPr>
-                <w:sz w:val="19"/>
-              </w:rPr>
-              <w:t>F1 B</w:t>
-            </w:r>
-          </w:p>
-        </w:tc>
-        <w:tc>
-          <w:tcPr>
-            <w:tcW w:type="dxa" w:w="1224"/>
-          </w:tcPr>
-          <w:p>
-            <w:pPr>
-              <w:spacing w:after="40"/>
-            </w:pPr>
-            <w:r>
-              <w:rPr>
-                <w:sz w:val="19"/>
-              </w:rPr>
-              <w:t>MEDIUM — fourth time near this topic</w:t>
-            </w:r>
-          </w:p>
-        </w:tc>
-      </w:tr>
-      <w:tr>
-        <w:tc>
-          <w:tcPr>
-            <w:tcW w:type="dxa" w:w="504"/>
-          </w:tcPr>
-          <w:p>
-            <w:pPr>
-              <w:spacing w:after="40"/>
-            </w:pPr>
-            <w:r>
-              <w:rPr>
-                <w:sz w:val="19"/>
-              </w:rPr>
-              <w:t>11</w:t>
-            </w:r>
-          </w:p>
-        </w:tc>
-        <w:tc>
-          <w:tcPr>
-            <w:tcW w:type="dxa" w:w="2088"/>
-          </w:tcPr>
-          <w:p>
-            <w:pPr>
-              <w:spacing w:after="40"/>
-            </w:pPr>
-            <w:r>
-              <w:rPr>
-                <w:b/>
-                <w:sz w:val="19"/>
-              </w:rPr>
-              <w:t>YOUR GRANDSON REALLY WAS ARRESTED — THE CALL IS STILL A SCAM</w:t>
-            </w:r>
-          </w:p>
-        </w:tc>
-        <w:tc>
-          <w:tcPr>
-            <w:tcW w:type="dxa" w:w="3384"/>
-          </w:tcPr>
-          <w:p>
-            <w:pPr>
-              <w:spacing w:after="40"/>
-            </w:pPr>
-            <w:r>
-              <w:rPr>
-                <w:sz w:val="19"/>
-              </w:rPr>
-              <w:t>The arrest is real, so checking the jail website makes the scam look true.</w:t>
-            </w:r>
-          </w:p>
-        </w:tc>
-        <w:tc>
-          <w:tcPr>
-            <w:tcW w:type="dxa" w:w="1224"/>
-          </w:tcPr>
-          <w:p>
-            <w:pPr>
-              <w:spacing w:after="40"/>
-            </w:pPr>
-            <w:r>
-              <w:rPr>
-                <w:sz w:val="19"/>
-              </w:rPr>
-              <w:t>—</w:t>
-            </w:r>
-          </w:p>
-        </w:tc>
-        <w:tc>
-          <w:tcPr>
-            <w:tcW w:type="dxa" w:w="1656"/>
-          </w:tcPr>
-          <w:p>
-            <w:pPr>
-              <w:spacing w:after="40"/>
-            </w:pPr>
-            <w:r>
-              <w:rPr>
-                <w:sz w:val="19"/>
-              </w:rPr>
-              <w:t>F2 B</w:t>
-            </w:r>
-          </w:p>
-        </w:tc>
-        <w:tc>
-          <w:tcPr>
-            <w:tcW w:type="dxa" w:w="1224"/>
-          </w:tcPr>
-          <w:p>
-            <w:pPr>
-              <w:spacing w:after="40"/>
-            </w:pPr>
-            <w:r>
-              <w:rPr>
-                <w:sz w:val="19"/>
-              </w:rPr>
-              <w:t>MEDIUM — new twist, low heat</w:t>
-            </w:r>
-          </w:p>
-        </w:tc>
-      </w:tr>
-      <w:tr>
-        <w:tc>
-          <w:tcPr>
-            <w:tcW w:type="dxa" w:w="504"/>
-          </w:tcPr>
-          <w:p>
-            <w:pPr>
-              <w:spacing w:after="40"/>
-            </w:pPr>
-            <w:r>
-              <w:rPr>
-                <w:sz w:val="19"/>
-              </w:rPr>
-              <w:t>12</w:t>
-            </w:r>
-          </w:p>
-        </w:tc>
-        <w:tc>
-          <w:tcPr>
-            <w:tcW w:type="dxa" w:w="2088"/>
-          </w:tcPr>
-          <w:p>
-            <w:pPr>
-              <w:spacing w:after="40"/>
-            </w:pPr>
-            <w:r>
-              <w:rPr>
-                <w:b/>
-                <w:sz w:val="19"/>
-              </w:rPr>
-              <w:t>YOU'RE PAYING FOR THE SAME CELL TOWERS</w:t>
-            </w:r>
-          </w:p>
-        </w:tc>
-        <w:tc>
-          <w:tcPr>
-            <w:tcW w:type="dxa" w:w="3384"/>
-          </w:tcPr>
-          <w:p>
-            <w:pPr>
-              <w:spacing w:after="40"/>
-            </w:pPr>
-            <w:r>
-              <w:rPr>
-                <w:sz w:val="19"/>
-              </w:rPr>
-              <w:t>Your carrier sells the same network for far less under another name.</w:t>
-            </w:r>
-          </w:p>
-        </w:tc>
-        <w:tc>
-          <w:tcPr>
-            <w:tcW w:type="dxa" w:w="1224"/>
-          </w:tcPr>
-          <w:p>
-            <w:pPr>
-              <w:spacing w:after="40"/>
-            </w:pPr>
-            <w:r>
-              <w:rPr>
-                <w:sz w:val="19"/>
-              </w:rPr>
-              <w:t>— (creator 466K)</w:t>
-            </w:r>
-          </w:p>
-        </w:tc>
-        <w:tc>
-          <w:tcPr>
-            <w:tcW w:type="dxa" w:w="1656"/>
-          </w:tcPr>
-          <w:p>
-            <w:pPr>
-              <w:spacing w:after="40"/>
-            </w:pPr>
-            <w:r>
-              <w:rPr>
-                <w:sz w:val="19"/>
-              </w:rPr>
-              <w:t>F1 C (deals lead-in)</w:t>
-            </w:r>
-          </w:p>
-        </w:tc>
-        <w:tc>
-          <w:tcPr>
-            <w:tcW w:type="dxa" w:w="1224"/>
-          </w:tcPr>
-          <w:p>
-            <w:pPr>
-              <w:spacing w:after="40"/>
-            </w:pPr>
-            <w:r>
-              <w:rPr>
-                <w:sz w:val="19"/>
-              </w:rPr>
-              <w:t>MEDIUM — service story, not a scam</w:t>
+              <w:t>MEDIUM</w:t>
             </w:r>
           </w:p>
         </w:tc>
@@ -1347,217 +1345,7 @@
         <w:t>SLATE FIT:</w:t>
       </w:r>
       <w:r>
-        <w:t xml:space="preserve"> Fills both shows with options left over.</w:t>
-      </w:r>
-    </w:p>
-    <w:p>
-      <w:pPr>
-        <w:pStyle w:val="ListBullet"/>
-        <w:spacing w:after="40"/>
-      </w:pPr>
-      <w:r>
-        <w:rPr>
-          <w:b/>
-        </w:rPr>
-        <w:t>F1 Fri 10/16:</w:t>
-      </w:r>
-    </w:p>
-    <w:p>
-      <w:pPr>
-        <w:pStyle w:val="ListBullet"/>
-        <w:spacing w:after="40"/>
-      </w:pPr>
-      <w:r>
-        <w:t xml:space="preserve">Lead with </w:t>
-      </w:r>
-      <w:r>
-        <w:rPr>
-          <w:b/>
-        </w:rPr>
-        <w:t>#2</w:t>
-      </w:r>
-      <w:r>
-        <w:t xml:space="preserve"> (live TV demo).</w:t>
-      </w:r>
-    </w:p>
-    <w:p>
-      <w:pPr>
-        <w:pStyle w:val="ListBullet"/>
-        <w:spacing w:after="40"/>
-      </w:pPr>
-      <w:r>
-        <w:t xml:space="preserve">B: </w:t>
-      </w:r>
-      <w:r>
-        <w:rPr>
-          <w:b/>
-        </w:rPr>
-        <w:t>#3</w:t>
-      </w:r>
-      <w:r>
-        <w:t>, the phone story. It has a villain, a victim, and a bank that says no.</w:t>
-      </w:r>
-    </w:p>
-    <w:p>
-      <w:pPr>
-        <w:pStyle w:val="ListBullet"/>
-        <w:spacing w:after="40"/>
-      </w:pPr>
-      <w:r>
-        <w:t xml:space="preserve">Before Trey's deals block: </w:t>
-      </w:r>
-      <w:r>
-        <w:rPr>
-          <w:b/>
-        </w:rPr>
-        <w:t>#9</w:t>
-      </w:r>
-      <w:r>
-        <w:t xml:space="preserve"> or </w:t>
-      </w:r>
-      <w:r>
-        <w:rPr>
-          <w:b/>
-        </w:rPr>
-        <w:t>#12</w:t>
-      </w:r>
-      <w:r>
-        <w:t>.</w:t>
-      </w:r>
-    </w:p>
-    <w:p>
-      <w:pPr>
-        <w:pStyle w:val="ListBullet"/>
-        <w:spacing w:after="40"/>
-      </w:pPr>
-      <w:r>
-        <w:rPr>
-          <w:b/>
-        </w:rPr>
-        <w:t>#10</w:t>
-      </w:r>
-      <w:r>
-        <w:t xml:space="preserve"> if the room wants the Walmart heat, or </w:t>
-      </w:r>
-      <w:r>
-        <w:rPr>
-          <w:b/>
-        </w:rPr>
-        <w:t>#8</w:t>
-      </w:r>
-      <w:r>
-        <w:t xml:space="preserve"> if it wants the season.</w:t>
-      </w:r>
-    </w:p>
-    <w:p>
-      <w:pPr>
-        <w:pStyle w:val="ListBullet"/>
-        <w:spacing w:after="40"/>
-      </w:pPr>
-      <w:r>
-        <w:rPr>
-          <w:b/>
-        </w:rPr>
-        <w:t>F2 Wed 10/21:</w:t>
-      </w:r>
-    </w:p>
-    <w:p>
-      <w:pPr>
-        <w:pStyle w:val="ListBullet"/>
-        <w:spacing w:after="40"/>
-      </w:pPr>
-      <w:r>
-        <w:t xml:space="preserve">A: </w:t>
-      </w:r>
-      <w:r>
-        <w:rPr>
-          <w:b/>
-        </w:rPr>
-        <w:t>#1</w:t>
-      </w:r>
-      <w:r>
-        <w:t>.</w:t>
-      </w:r>
-    </w:p>
-    <w:p>
-      <w:pPr>
-        <w:pStyle w:val="ListBullet"/>
-        <w:spacing w:after="40"/>
-      </w:pPr>
-      <w:r>
-        <w:t xml:space="preserve">B: </w:t>
-      </w:r>
-      <w:r>
-        <w:rPr>
-          <w:b/>
-        </w:rPr>
-        <w:t>#5</w:t>
-      </w:r>
-      <w:r>
-        <w:t xml:space="preserve"> or </w:t>
-      </w:r>
-      <w:r>
-        <w:rPr>
-          <w:b/>
-        </w:rPr>
-        <w:t>#7</w:t>
-      </w:r>
-      <w:r>
-        <w:t>.</w:t>
-      </w:r>
-    </w:p>
-    <w:p>
-      <w:pPr>
-        <w:pStyle w:val="ListBullet"/>
-        <w:spacing w:after="40"/>
-      </w:pPr>
-      <w:r>
-        <w:t xml:space="preserve">C: </w:t>
-      </w:r>
-      <w:r>
-        <w:rPr>
-          <w:b/>
-        </w:rPr>
-        <w:t>#6</w:t>
-      </w:r>
-      <w:r>
-        <w:t>, holiday travel.</w:t>
-      </w:r>
-    </w:p>
-    <w:p>
-      <w:pPr>
-        <w:pStyle w:val="ListBullet"/>
-        <w:spacing w:after="40"/>
-      </w:pPr>
-      <w:r>
-        <w:t xml:space="preserve">Alternate A: </w:t>
-      </w:r>
-      <w:r>
-        <w:rPr>
-          <w:b/>
-        </w:rPr>
-        <w:t>#5</w:t>
-      </w:r>
-      <w:r>
-        <w:t>.</w:t>
-      </w:r>
-    </w:p>
-    <w:p>
-      <w:pPr>
-        <w:pStyle w:val="ListBullet"/>
-        <w:spacing w:after="40"/>
-      </w:pPr>
-      <w:r>
-        <w:t xml:space="preserve">⚠️ </w:t>
-      </w:r>
-      <w:r>
-        <w:rPr>
-          <w:b/>
-        </w:rPr>
-        <w:t>Too many "trusted hands" stories in one week:</w:t>
-      </w:r>
-      <w:r>
-        <w:t xml:space="preserve"> #1, #3, #4 and #7 are all "someone you trust takes your money." Pick two across both shows.</w:t>
+        <w:t xml:space="preserve"> F1: #2 lead, #3 B, #9 or #12. F2: #1 A, #5 or #7 B, #6 C. ⚠️ #1, #3, #4, #7 share one theme. Pick two.</w:t>
       </w:r>
     </w:p>
     <w:p>

</xml_diff>

<commit_message>
Combined pre-bible: descriptive beats, linked view counts, measured column widths (fit to 6.9in), Doc widths set via Docs API
Co-Authored-By: Claude Opus 5.5 <noreply@anthropic.com>
Claude-Session: https://claude.ai/code/session_01JXZTYoXrbpFAh6f3eiaAfw
</commit_message>
<xml_diff>
--- a/runs/W_10212026/10_16_and_10_21_Pre_Bible_Pitch.docx
+++ b/runs/W_10212026/10_16_and_10_21_Pre_Bible_Pitch.docx
@@ -55,11 +55,11 @@
       </w:tblPr>
       <w:tblGrid>
         <w:gridCol w:w="432"/>
-        <w:gridCol w:w="1800"/>
-        <w:gridCol w:w="3744"/>
-        <w:gridCol w:w="1440"/>
+        <w:gridCol w:w="1152"/>
+        <w:gridCol w:w="5040"/>
+        <w:gridCol w:w="1007"/>
+        <w:gridCol w:w="1080"/>
         <w:gridCol w:w="1224"/>
-        <w:gridCol w:w="1296"/>
       </w:tblGrid>
       <w:tr>
         <w:tc>
@@ -78,7 +78,7 @@
         </w:tc>
         <w:tc>
           <w:tcPr>
-            <w:tcW w:type="dxa" w:w="1800"/>
+            <w:tcW w:type="dxa" w:w="1152"/>
           </w:tcPr>
           <w:p>
             <w:r>
@@ -92,7 +92,7 @@
         </w:tc>
         <w:tc>
           <w:tcPr>
-            <w:tcW w:type="dxa" w:w="3744"/>
+            <w:tcW w:type="dxa" w:w="5040"/>
           </w:tcPr>
           <w:p>
             <w:r>
@@ -106,7 +106,7 @@
         </w:tc>
         <w:tc>
           <w:tcPr>
-            <w:tcW w:type="dxa" w:w="1440"/>
+            <w:tcW w:type="dxa" w:w="1008"/>
           </w:tcPr>
           <w:p>
             <w:r>
@@ -120,7 +120,7 @@
         </w:tc>
         <w:tc>
           <w:tcPr>
-            <w:tcW w:type="dxa" w:w="1224"/>
+            <w:tcW w:type="dxa" w:w="1080"/>
           </w:tcPr>
           <w:p>
             <w:r>
@@ -134,7 +134,7 @@
         </w:tc>
         <w:tc>
           <w:tcPr>
-            <w:tcW w:type="dxa" w:w="1296"/>
+            <w:tcW w:type="dxa" w:w="1224"/>
           </w:tcPr>
           <w:p>
             <w:r>
@@ -166,7 +166,7 @@
         </w:tc>
         <w:tc>
           <w:tcPr>
-            <w:tcW w:type="dxa" w:w="1800"/>
+            <w:tcW w:type="dxa" w:w="1152"/>
           </w:tcPr>
           <w:p>
             <w:pPr>
@@ -183,7 +183,7 @@
         </w:tc>
         <w:tc>
           <w:tcPr>
-            <w:tcW w:type="dxa" w:w="3744"/>
+            <w:tcW w:type="dxa" w:w="5040"/>
           </w:tcPr>
           <w:p>
             <w:pPr>
@@ -193,13 +193,13 @@
               <w:rPr>
                 <w:sz w:val="19"/>
               </w:rPr>
-              <w:t>You hand over your ticket and never see the winnings.</w:t>
+              <w:t>Clerks pocket customers' winning tickets. Police say a Walmart cashier kept an older man's winner; fake "winners" drove an 82-year-old to her bank and took $2,500.</w:t>
             </w:r>
           </w:p>
         </w:tc>
         <w:tc>
           <w:tcPr>
-            <w:tcW w:type="dxa" w:w="1440"/>
+            <w:tcW w:type="dxa" w:w="1008"/>
           </w:tcPr>
           <w:p>
             <w:pPr>
@@ -209,13 +209,39 @@
               <w:rPr>
                 <w:sz w:val="19"/>
               </w:rPr>
-              <w:t>🔥 252K · 255K</w:t>
+              <w:t xml:space="preserve">🔥 </w:t>
             </w:r>
+            <w:hyperlink r:id="rId9">
+              <w:r>
+                <w:rPr>
+                  <w:sz w:val="19"/>
+                  <w:color w:val="0563C1"/>
+                  <w:u w:val="single"/>
+                </w:rPr>
+                <w:t xml:space="preserve">252K</w:t>
+              </w:r>
+            </w:hyperlink>
+            <w:r>
+              <w:rPr>
+                <w:sz w:val="19"/>
+              </w:rPr>
+              <w:t xml:space="preserve"> · </w:t>
+            </w:r>
+            <w:hyperlink r:id="rId10">
+              <w:r>
+                <w:rPr>
+                  <w:sz w:val="19"/>
+                  <w:color w:val="0563C1"/>
+                  <w:u w:val="single"/>
+                </w:rPr>
+                <w:t xml:space="preserve">255K</w:t>
+              </w:r>
+            </w:hyperlink>
           </w:p>
         </w:tc>
         <w:tc>
           <w:tcPr>
-            <w:tcW w:type="dxa" w:w="1224"/>
+            <w:tcW w:type="dxa" w:w="1080"/>
           </w:tcPr>
           <w:p>
             <w:pPr>
@@ -231,7 +257,7 @@
         </w:tc>
         <w:tc>
           <w:tcPr>
-            <w:tcW w:type="dxa" w:w="1296"/>
+            <w:tcW w:type="dxa" w:w="1224"/>
           </w:tcPr>
           <w:p>
             <w:pPr>
@@ -265,7 +291,7 @@
         </w:tc>
         <w:tc>
           <w:tcPr>
-            <w:tcW w:type="dxa" w:w="1800"/>
+            <w:tcW w:type="dxa" w:w="1152"/>
           </w:tcPr>
           <w:p>
             <w:pPr>
@@ -282,7 +308,7 @@
         </w:tc>
         <w:tc>
           <w:tcPr>
-            <w:tcW w:type="dxa" w:w="3744"/>
+            <w:tcW w:type="dxa" w:w="5040"/>
           </w:tcPr>
           <w:p>
             <w:pPr>
@@ -292,13 +318,13 @@
               <w:rPr>
                 <w:sz w:val="19"/>
               </w:rPr>
-              <w:t>Your TV watches what you watch, and may be listening.</w:t>
+              <w:t>Smart TVs track everything you watch, and a September investigation claims LG sets record audio in standby (LG denies it). Jeff turns the tracking off live.</w:t>
             </w:r>
           </w:p>
         </w:tc>
         <w:tc>
           <w:tcPr>
-            <w:tcW w:type="dxa" w:w="1440"/>
+            <w:tcW w:type="dxa" w:w="1008"/>
           </w:tcPr>
           <w:p>
             <w:pPr>
@@ -308,7 +334,49 @@
               <w:rPr>
                 <w:sz w:val="19"/>
               </w:rPr>
-              <w:t>🔥 8.1M · 1.07M</w:t>
+              <w:t xml:space="preserve">🔥 </w:t>
+            </w:r>
+            <w:hyperlink r:id="rId11">
+              <w:r>
+                <w:rPr>
+                  <w:sz w:val="19"/>
+                  <w:color w:val="0563C1"/>
+                  <w:u w:val="single"/>
+                </w:rPr>
+                <w:t xml:space="preserve">8.1M</w:t>
+              </w:r>
+            </w:hyperlink>
+            <w:r>
+              <w:rPr>
+                <w:sz w:val="19"/>
+              </w:rPr>
+              <w:t xml:space="preserve"> · </w:t>
+            </w:r>
+            <w:hyperlink r:id="rId12">
+              <w:r>
+                <w:rPr>
+                  <w:sz w:val="19"/>
+                  <w:color w:val="0563C1"/>
+                  <w:u w:val="single"/>
+                </w:rPr>
+                <w:t xml:space="preserve">1.07M</w:t>
+              </w:r>
+            </w:hyperlink>
+          </w:p>
+        </w:tc>
+        <w:tc>
+          <w:tcPr>
+            <w:tcW w:type="dxa" w:w="1080"/>
+          </w:tcPr>
+          <w:p>
+            <w:pPr>
+              <w:spacing w:after="40"/>
+            </w:pPr>
+            <w:r>
+              <w:rPr>
+                <w:sz w:val="19"/>
+              </w:rPr>
+              <w:t>F1 lead (rec.)</w:t>
             </w:r>
           </w:p>
         </w:tc>
@@ -324,23 +392,7 @@
               <w:rPr>
                 <w:sz w:val="19"/>
               </w:rPr>
-              <w:t>F1 lead (rec.)</w:t>
-            </w:r>
-          </w:p>
-        </w:tc>
-        <w:tc>
-          <w:tcPr>
-            <w:tcW w:type="dxa" w:w="1296"/>
-          </w:tcPr>
-          <w:p>
-            <w:pPr>
-              <w:spacing w:after="40"/>
-            </w:pPr>
-            <w:r>
-              <w:rPr>
-                <w:sz w:val="19"/>
-              </w:rPr>
-              <w:t>HIGH — 3rd TV video</w:t>
+              <w:t>HIGH, 3rd TV video</w:t>
             </w:r>
           </w:p>
         </w:tc>
@@ -364,7 +416,7 @@
         </w:tc>
         <w:tc>
           <w:tcPr>
-            <w:tcW w:type="dxa" w:w="1800"/>
+            <w:tcW w:type="dxa" w:w="1152"/>
           </w:tcPr>
           <w:p>
             <w:pPr>
@@ -381,7 +433,7 @@
         </w:tc>
         <w:tc>
           <w:tcPr>
-            <w:tcW w:type="dxa" w:w="3744"/>
+            <w:tcW w:type="dxa" w:w="5040"/>
           </w:tcPr>
           <w:p>
             <w:pPr>
@@ -391,13 +443,13 @@
               <w:rPr>
                 <w:sz w:val="19"/>
               </w:rPr>
-              <w:t>Ten seconds with your phone, and the bank says it's your fault.</w:t>
+              <w:t>An Atlanta woman scanned a street seller's QR code to pay $2 for water, shared her screen, and lost $2,400. Her bank won't refund it.</w:t>
             </w:r>
           </w:p>
         </w:tc>
         <w:tc>
           <w:tcPr>
-            <w:tcW w:type="dxa" w:w="1440"/>
+            <w:tcW w:type="dxa" w:w="1008"/>
           </w:tcPr>
           <w:p>
             <w:pPr>
@@ -407,7 +459,49 @@
               <w:rPr>
                 <w:sz w:val="19"/>
               </w:rPr>
-              <w:t>🔥 72K in 5 days · 3.1M</w:t>
+              <w:t xml:space="preserve">🔥 </w:t>
+            </w:r>
+            <w:hyperlink r:id="rId13">
+              <w:r>
+                <w:rPr>
+                  <w:sz w:val="19"/>
+                  <w:color w:val="0563C1"/>
+                  <w:u w:val="single"/>
+                </w:rPr>
+                <w:t xml:space="preserve">72K</w:t>
+              </w:r>
+            </w:hyperlink>
+            <w:r>
+              <w:rPr>
+                <w:sz w:val="19"/>
+              </w:rPr>
+              <w:t xml:space="preserve"> · </w:t>
+            </w:r>
+            <w:hyperlink r:id="rId14">
+              <w:r>
+                <w:rPr>
+                  <w:sz w:val="19"/>
+                  <w:color w:val="0563C1"/>
+                  <w:u w:val="single"/>
+                </w:rPr>
+                <w:t xml:space="preserve">3.1M</w:t>
+              </w:r>
+            </w:hyperlink>
+          </w:p>
+        </w:tc>
+        <w:tc>
+          <w:tcPr>
+            <w:tcW w:type="dxa" w:w="1080"/>
+          </w:tcPr>
+          <w:p>
+            <w:pPr>
+              <w:spacing w:after="40"/>
+            </w:pPr>
+            <w:r>
+              <w:rPr>
+                <w:sz w:val="19"/>
+              </w:rPr>
+              <w:t>F1 B / F2 A</w:t>
             </w:r>
           </w:p>
         </w:tc>
@@ -423,23 +517,7 @@
               <w:rPr>
                 <w:sz w:val="19"/>
               </w:rPr>
-              <w:t>F1 B / F2 A</w:t>
-            </w:r>
-          </w:p>
-        </w:tc>
-        <w:tc>
-          <w:tcPr>
-            <w:tcW w:type="dxa" w:w="1296"/>
-          </w:tcPr>
-          <w:p>
-            <w:pPr>
-              <w:spacing w:after="40"/>
-            </w:pPr>
-            <w:r>
-              <w:rPr>
-                <w:sz w:val="19"/>
-              </w:rPr>
-              <w:t>MEDIUM</w:t>
+              <w:t>MED</w:t>
             </w:r>
           </w:p>
         </w:tc>
@@ -463,7 +541,7 @@
         </w:tc>
         <w:tc>
           <w:tcPr>
-            <w:tcW w:type="dxa" w:w="1800"/>
+            <w:tcW w:type="dxa" w:w="1152"/>
           </w:tcPr>
           <w:p>
             <w:pPr>
@@ -480,7 +558,7 @@
         </w:tc>
         <w:tc>
           <w:tcPr>
-            <w:tcW w:type="dxa" w:w="3744"/>
+            <w:tcW w:type="dxa" w:w="5040"/>
           </w:tcPr>
           <w:p>
             <w:pPr>
@@ -490,13 +568,13 @@
               <w:rPr>
                 <w:sz w:val="19"/>
               </w:rPr>
-              <w:t>The friendly teller is the one draining you.</w:t>
+              <w:t>Tellers draining older customers' accounts: police say one left an 86-year-old with $1.50; a Santander worker got 30 months on Oct 9 for taking $125,000.</w:t>
             </w:r>
           </w:p>
         </w:tc>
         <w:tc>
           <w:tcPr>
-            <w:tcW w:type="dxa" w:w="1440"/>
+            <w:tcW w:type="dxa" w:w="1008"/>
           </w:tcPr>
           <w:p>
             <w:pPr>
@@ -506,7 +584,33 @@
               <w:rPr>
                 <w:sz w:val="19"/>
               </w:rPr>
-              <w:t>🔥 432K</w:t>
+              <w:t xml:space="preserve">🔥 </w:t>
+            </w:r>
+            <w:hyperlink r:id="rId15">
+              <w:r>
+                <w:rPr>
+                  <w:sz w:val="19"/>
+                  <w:color w:val="0563C1"/>
+                  <w:u w:val="single"/>
+                </w:rPr>
+                <w:t xml:space="preserve">432K</w:t>
+              </w:r>
+            </w:hyperlink>
+          </w:p>
+        </w:tc>
+        <w:tc>
+          <w:tcPr>
+            <w:tcW w:type="dxa" w:w="1080"/>
+          </w:tcPr>
+          <w:p>
+            <w:pPr>
+              <w:spacing w:after="40"/>
+            </w:pPr>
+            <w:r>
+              <w:rPr>
+                <w:sz w:val="19"/>
+              </w:rPr>
+              <w:t>F1 B / F2 A</w:t>
             </w:r>
           </w:p>
         </w:tc>
@@ -522,23 +626,7 @@
               <w:rPr>
                 <w:sz w:val="19"/>
               </w:rPr>
-              <w:t>F1 B / F2 A</w:t>
-            </w:r>
-          </w:p>
-        </w:tc>
-        <w:tc>
-          <w:tcPr>
-            <w:tcW w:type="dxa" w:w="1296"/>
-          </w:tcPr>
-          <w:p>
-            <w:pPr>
-              <w:spacing w:after="40"/>
-            </w:pPr>
-            <w:r>
-              <w:rPr>
-                <w:sz w:val="19"/>
-              </w:rPr>
-              <w:t>MEDIUM</w:t>
+              <w:t>MED</w:t>
             </w:r>
           </w:p>
         </w:tc>
@@ -562,7 +650,7 @@
         </w:tc>
         <w:tc>
           <w:tcPr>
-            <w:tcW w:type="dxa" w:w="1800"/>
+            <w:tcW w:type="dxa" w:w="1152"/>
           </w:tcPr>
           <w:p>
             <w:pPr>
@@ -579,7 +667,7 @@
         </w:tc>
         <w:tc>
           <w:tcPr>
-            <w:tcW w:type="dxa" w:w="3744"/>
+            <w:tcW w:type="dxa" w:w="5040"/>
           </w:tcPr>
           <w:p>
             <w:pPr>
@@ -589,13 +677,13 @@
               <w:rPr>
                 <w:sz w:val="19"/>
               </w:rPr>
-              <w:t>A "star" on Facebook wants your savings.</w:t>
+              <w:t>Fake and deepfake celebrities message fans on Facebook. One woman lost $81,000 and her condo; the FBI just found 35 more victims of a fake NFL player.</w:t>
             </w:r>
           </w:p>
         </w:tc>
         <w:tc>
           <w:tcPr>
-            <w:tcW w:type="dxa" w:w="1440"/>
+            <w:tcW w:type="dxa" w:w="1008"/>
           </w:tcPr>
           <w:p>
             <w:pPr>
@@ -605,7 +693,49 @@
               <w:rPr>
                 <w:sz w:val="19"/>
               </w:rPr>
-              <w:t>🔥 585K · 296K</w:t>
+              <w:t xml:space="preserve">🔥 </w:t>
+            </w:r>
+            <w:hyperlink r:id="rId16">
+              <w:r>
+                <w:rPr>
+                  <w:sz w:val="19"/>
+                  <w:color w:val="0563C1"/>
+                  <w:u w:val="single"/>
+                </w:rPr>
+                <w:t xml:space="preserve">585K</w:t>
+              </w:r>
+            </w:hyperlink>
+            <w:r>
+              <w:rPr>
+                <w:sz w:val="19"/>
+              </w:rPr>
+              <w:t xml:space="preserve"> · </w:t>
+            </w:r>
+            <w:hyperlink r:id="rId17">
+              <w:r>
+                <w:rPr>
+                  <w:sz w:val="19"/>
+                  <w:color w:val="0563C1"/>
+                  <w:u w:val="single"/>
+                </w:rPr>
+                <w:t xml:space="preserve">296K</w:t>
+              </w:r>
+            </w:hyperlink>
+          </w:p>
+        </w:tc>
+        <w:tc>
+          <w:tcPr>
+            <w:tcW w:type="dxa" w:w="1080"/>
+          </w:tcPr>
+          <w:p>
+            <w:pPr>
+              <w:spacing w:after="40"/>
+            </w:pPr>
+            <w:r>
+              <w:rPr>
+                <w:sz w:val="19"/>
+              </w:rPr>
+              <w:t>F2 alt. A</w:t>
             </w:r>
           </w:p>
         </w:tc>
@@ -621,23 +751,7 @@
               <w:rPr>
                 <w:sz w:val="19"/>
               </w:rPr>
-              <w:t>F2 alt. A</w:t>
-            </w:r>
-          </w:p>
-        </w:tc>
-        <w:tc>
-          <w:tcPr>
-            <w:tcW w:type="dxa" w:w="1296"/>
-          </w:tcPr>
-          <w:p>
-            <w:pPr>
-              <w:spacing w:after="40"/>
-            </w:pPr>
-            <w:r>
-              <w:rPr>
-                <w:sz w:val="19"/>
-              </w:rPr>
-              <w:t>MEDIUM</w:t>
+              <w:t>MED</w:t>
             </w:r>
           </w:p>
         </w:tc>
@@ -661,7 +775,7 @@
         </w:tc>
         <w:tc>
           <w:tcPr>
-            <w:tcW w:type="dxa" w:w="1800"/>
+            <w:tcW w:type="dxa" w:w="1152"/>
           </w:tcPr>
           <w:p>
             <w:pPr>
@@ -678,7 +792,7 @@
         </w:tc>
         <w:tc>
           <w:tcPr>
-            <w:tcW w:type="dxa" w:w="3744"/>
+            <w:tcW w:type="dxa" w:w="5040"/>
           </w:tcPr>
           <w:p>
             <w:pPr>
@@ -688,13 +802,13 @@
               <w:rPr>
                 <w:sz w:val="19"/>
               </w:rPr>
-              <w:t>The damage bill arrives weeks later. The photo is fake.</w:t>
+              <w:t>Turo hosts and rental companies bill you weeks later for damage you didn't do; one host's "proof" was an old Reddit photo. Plus surprise hotel fees after you prepay.</w:t>
             </w:r>
           </w:p>
         </w:tc>
         <w:tc>
           <w:tcPr>
-            <w:tcW w:type="dxa" w:w="1440"/>
+            <w:tcW w:type="dxa" w:w="1008"/>
           </w:tcPr>
           <w:p>
             <w:pPr>
@@ -704,7 +818,49 @@
               <w:rPr>
                 <w:sz w:val="19"/>
               </w:rPr>
-              <w:t>🔥 547K in 5 days</w:t>
+              <w:t xml:space="preserve">🔥 </w:t>
+            </w:r>
+            <w:hyperlink r:id="rId18">
+              <w:r>
+                <w:rPr>
+                  <w:sz w:val="19"/>
+                  <w:color w:val="0563C1"/>
+                  <w:u w:val="single"/>
+                </w:rPr>
+                <w:t xml:space="preserve">547K</w:t>
+              </w:r>
+            </w:hyperlink>
+            <w:r>
+              <w:rPr>
+                <w:sz w:val="19"/>
+              </w:rPr>
+              <w:t xml:space="preserve"> · </w:t>
+            </w:r>
+            <w:hyperlink r:id="rId19">
+              <w:r>
+                <w:rPr>
+                  <w:sz w:val="19"/>
+                  <w:color w:val="0563C1"/>
+                  <w:u w:val="single"/>
+                </w:rPr>
+                <w:t xml:space="preserve">234K</w:t>
+              </w:r>
+            </w:hyperlink>
+          </w:p>
+        </w:tc>
+        <w:tc>
+          <w:tcPr>
+            <w:tcW w:type="dxa" w:w="1080"/>
+          </w:tcPr>
+          <w:p>
+            <w:pPr>
+              <w:spacing w:after="40"/>
+            </w:pPr>
+            <w:r>
+              <w:rPr>
+                <w:sz w:val="19"/>
+              </w:rPr>
+              <w:t>F2 A/B · holidays</w:t>
             </w:r>
           </w:p>
         </w:tc>
@@ -720,23 +876,7 @@
               <w:rPr>
                 <w:sz w:val="19"/>
               </w:rPr>
-              <w:t>F2 A/B · holidays</w:t>
-            </w:r>
-          </w:p>
-        </w:tc>
-        <w:tc>
-          <w:tcPr>
-            <w:tcW w:type="dxa" w:w="1296"/>
-          </w:tcPr>
-          <w:p>
-            <w:pPr>
-              <w:spacing w:after="40"/>
-            </w:pPr>
-            <w:r>
-              <w:rPr>
-                <w:sz w:val="19"/>
-              </w:rPr>
-              <w:t>MEDIUM — travel lags</w:t>
+              <w:t>MED, travel lags</w:t>
             </w:r>
           </w:p>
         </w:tc>
@@ -760,7 +900,7 @@
         </w:tc>
         <w:tc>
           <w:tcPr>
-            <w:tcW w:type="dxa" w:w="1800"/>
+            <w:tcW w:type="dxa" w:w="1152"/>
           </w:tcPr>
           <w:p>
             <w:pPr>
@@ -777,7 +917,7 @@
         </w:tc>
         <w:tc>
           <w:tcPr>
-            <w:tcW w:type="dxa" w:w="3744"/>
+            <w:tcW w:type="dxa" w:w="5040"/>
           </w:tcPr>
           <w:p>
             <w:pPr>
@@ -787,13 +927,13 @@
               <w:rPr>
                 <w:sz w:val="19"/>
               </w:rPr>
-              <w:t>A hug, a "gift" necklace, and your gold is gone.</w:t>
+              <w:t>Strangers hug older people or drape a "gift" necklace on them, then swap their real gold for fakes. NYPD: 11 victims, $90,000; arrests on Long Island Oct 7.</w:t>
             </w:r>
           </w:p>
         </w:tc>
         <w:tc>
           <w:tcPr>
-            <w:tcW w:type="dxa" w:w="1440"/>
+            <w:tcW w:type="dxa" w:w="1008"/>
           </w:tcPr>
           <w:p>
             <w:pPr>
@@ -803,7 +943,49 @@
               <w:rPr>
                 <w:sz w:val="19"/>
               </w:rPr>
-              <w:t>🔥 1.1M (Canada) · 447K</w:t>
+              <w:t xml:space="preserve">🔥 </w:t>
+            </w:r>
+            <w:hyperlink r:id="rId20">
+              <w:r>
+                <w:rPr>
+                  <w:sz w:val="19"/>
+                  <w:color w:val="0563C1"/>
+                  <w:u w:val="single"/>
+                </w:rPr>
+                <w:t xml:space="preserve">1.1M</w:t>
+              </w:r>
+            </w:hyperlink>
+            <w:r>
+              <w:rPr>
+                <w:sz w:val="19"/>
+              </w:rPr>
+              <w:t xml:space="preserve"> · </w:t>
+            </w:r>
+            <w:hyperlink r:id="rId21">
+              <w:r>
+                <w:rPr>
+                  <w:sz w:val="19"/>
+                  <w:color w:val="0563C1"/>
+                  <w:u w:val="single"/>
+                </w:rPr>
+                <w:t xml:space="preserve">447K</w:t>
+              </w:r>
+            </w:hyperlink>
+          </w:p>
+        </w:tc>
+        <w:tc>
+          <w:tcPr>
+            <w:tcW w:type="dxa" w:w="1080"/>
+          </w:tcPr>
+          <w:p>
+            <w:pPr>
+              <w:spacing w:after="40"/>
+            </w:pPr>
+            <w:r>
+              <w:rPr>
+                <w:sz w:val="19"/>
+              </w:rPr>
+              <w:t>F2 B</w:t>
             </w:r>
           </w:p>
         </w:tc>
@@ -819,23 +1001,7 @@
               <w:rPr>
                 <w:sz w:val="19"/>
               </w:rPr>
-              <w:t>F2 B</w:t>
-            </w:r>
-          </w:p>
-        </w:tc>
-        <w:tc>
-          <w:tcPr>
-            <w:tcW w:type="dxa" w:w="1296"/>
-          </w:tcPr>
-          <w:p>
-            <w:pPr>
-              <w:spacing w:after="40"/>
-            </w:pPr>
-            <w:r>
-              <w:rPr>
-                <w:sz w:val="19"/>
-              </w:rPr>
-              <w:t>MEDIUM</w:t>
+              <w:t>MED</w:t>
             </w:r>
           </w:p>
         </w:tc>
@@ -859,7 +1025,7 @@
         </w:tc>
         <w:tc>
           <w:tcPr>
-            <w:tcW w:type="dxa" w:w="1800"/>
+            <w:tcW w:type="dxa" w:w="1152"/>
           </w:tcPr>
           <w:p>
             <w:pPr>
@@ -876,7 +1042,7 @@
         </w:tc>
         <w:tc>
           <w:tcPr>
-            <w:tcW w:type="dxa" w:w="3744"/>
+            <w:tcW w:type="dxa" w:w="5040"/>
           </w:tcPr>
           <w:p>
             <w:pPr>
@@ -886,13 +1052,13 @@
               <w:rPr>
                 <w:sz w:val="19"/>
               </w:rPr>
-              <w:t>A caller "protects" your rate, and it nearly doubles.</w:t>
+              <w:t>Electric bills rise this winter (EIA, Oct 6). Callers claiming to be your utility switch you to a supplier charging nearly double.</w:t>
             </w:r>
           </w:p>
         </w:tc>
         <w:tc>
           <w:tcPr>
-            <w:tcW w:type="dxa" w:w="1440"/>
+            <w:tcW w:type="dxa" w:w="1008"/>
           </w:tcPr>
           <w:p>
             <w:pPr>
@@ -902,7 +1068,49 @@
               <w:rPr>
                 <w:sz w:val="19"/>
               </w:rPr>
-              <w:t>🔥 1.83M · 730K</w:t>
+              <w:t xml:space="preserve">🔥 </w:t>
+            </w:r>
+            <w:hyperlink r:id="rId22">
+              <w:r>
+                <w:rPr>
+                  <w:sz w:val="19"/>
+                  <w:color w:val="0563C1"/>
+                  <w:u w:val="single"/>
+                </w:rPr>
+                <w:t xml:space="preserve">1.83M</w:t>
+              </w:r>
+            </w:hyperlink>
+            <w:r>
+              <w:rPr>
+                <w:sz w:val="19"/>
+              </w:rPr>
+              <w:t xml:space="preserve"> · </w:t>
+            </w:r>
+            <w:hyperlink r:id="rId23">
+              <w:r>
+                <w:rPr>
+                  <w:sz w:val="19"/>
+                  <w:color w:val="0563C1"/>
+                  <w:u w:val="single"/>
+                </w:rPr>
+                <w:t xml:space="preserve">730K</w:t>
+              </w:r>
+            </w:hyperlink>
+          </w:p>
+        </w:tc>
+        <w:tc>
+          <w:tcPr>
+            <w:tcW w:type="dxa" w:w="1080"/>
+          </w:tcPr>
+          <w:p>
+            <w:pPr>
+              <w:spacing w:after="40"/>
+            </w:pPr>
+            <w:r>
+              <w:rPr>
+                <w:sz w:val="19"/>
+              </w:rPr>
+              <w:t>F1 lead/B</w:t>
             </w:r>
           </w:p>
         </w:tc>
@@ -918,23 +1126,7 @@
               <w:rPr>
                 <w:sz w:val="19"/>
               </w:rPr>
-              <w:t>F1 lead/B</w:t>
-            </w:r>
-          </w:p>
-        </w:tc>
-        <w:tc>
-          <w:tcPr>
-            <w:tcW w:type="dxa" w:w="1296"/>
-          </w:tcPr>
-          <w:p>
-            <w:pPr>
-              <w:spacing w:after="40"/>
-            </w:pPr>
-            <w:r>
-              <w:rPr>
-                <w:sz w:val="19"/>
-              </w:rPr>
-              <w:t>MEDIUM</w:t>
+              <w:t>MED</w:t>
             </w:r>
           </w:p>
         </w:tc>
@@ -958,7 +1150,7 @@
         </w:tc>
         <w:tc>
           <w:tcPr>
-            <w:tcW w:type="dxa" w:w="1800"/>
+            <w:tcW w:type="dxa" w:w="1152"/>
           </w:tcPr>
           <w:p>
             <w:pPr>
@@ -975,7 +1167,7 @@
         </w:tc>
         <w:tc>
           <w:tcPr>
-            <w:tcW w:type="dxa" w:w="3744"/>
+            <w:tcW w:type="dxa" w:w="5040"/>
           </w:tcPr>
           <w:p>
             <w:pPr>
@@ -985,13 +1177,13 @@
               <w:rPr>
                 <w:sz w:val="19"/>
               </w:rPr>
-              <w:t>The cheaper price exists. Nobody has to tell you.</w:t>
+              <w:t>Your insurance copay can cost more than the cash price with a coupon, and pharmacists don't have to tell you. Jeff checks prices at the counter.</w:t>
             </w:r>
           </w:p>
         </w:tc>
         <w:tc>
           <w:tcPr>
-            <w:tcW w:type="dxa" w:w="1440"/>
+            <w:tcW w:type="dxa" w:w="1008"/>
           </w:tcPr>
           <w:p>
             <w:pPr>
@@ -1007,7 +1199,7 @@
         </w:tc>
         <w:tc>
           <w:tcPr>
-            <w:tcW w:type="dxa" w:w="1224"/>
+            <w:tcW w:type="dxa" w:w="1080"/>
           </w:tcPr>
           <w:p>
             <w:pPr>
@@ -1023,7 +1215,7 @@
         </w:tc>
         <w:tc>
           <w:tcPr>
-            <w:tcW w:type="dxa" w:w="1296"/>
+            <w:tcW w:type="dxa" w:w="1224"/>
           </w:tcPr>
           <w:p>
             <w:pPr>
@@ -1033,7 +1225,7 @@
               <w:rPr>
                 <w:sz w:val="19"/>
               </w:rPr>
-              <w:t>MEDIUM</w:t>
+              <w:t>MED</w:t>
             </w:r>
           </w:p>
         </w:tc>
@@ -1057,7 +1249,7 @@
         </w:tc>
         <w:tc>
           <w:tcPr>
-            <w:tcW w:type="dxa" w:w="1800"/>
+            <w:tcW w:type="dxa" w:w="1152"/>
           </w:tcPr>
           <w:p>
             <w:pPr>
@@ -1074,7 +1266,7 @@
         </w:tc>
         <w:tc>
           <w:tcPr>
-            <w:tcW w:type="dxa" w:w="3744"/>
+            <w:tcW w:type="dxa" w:w="5040"/>
           </w:tcPr>
           <w:p>
             <w:pPr>
@@ -1084,13 +1276,13 @@
               <w:rPr>
                 <w:sz w:val="19"/>
               </w:rPr>
-              <w:t>Their patents describe pricing you, not the product.</w:t>
+              <w:t>Walmart's digital shelf tags can change prices in seconds; a new report says its patents describe pricing by what's in your cart. Walmart denies doing it.</w:t>
             </w:r>
           </w:p>
         </w:tc>
         <w:tc>
           <w:tcPr>
-            <w:tcW w:type="dxa" w:w="1440"/>
+            <w:tcW w:type="dxa" w:w="1008"/>
           </w:tcPr>
           <w:p>
             <w:pPr>
@@ -1100,7 +1292,49 @@
               <w:rPr>
                 <w:sz w:val="19"/>
               </w:rPr>
-              <w:t>🔥 3.3M · 588K</w:t>
+              <w:t xml:space="preserve">🔥 </w:t>
+            </w:r>
+            <w:hyperlink r:id="rId24">
+              <w:r>
+                <w:rPr>
+                  <w:sz w:val="19"/>
+                  <w:color w:val="0563C1"/>
+                  <w:u w:val="single"/>
+                </w:rPr>
+                <w:t xml:space="preserve">3.3M</w:t>
+              </w:r>
+            </w:hyperlink>
+            <w:r>
+              <w:rPr>
+                <w:sz w:val="19"/>
+              </w:rPr>
+              <w:t xml:space="preserve"> · </w:t>
+            </w:r>
+            <w:hyperlink r:id="rId25">
+              <w:r>
+                <w:rPr>
+                  <w:sz w:val="19"/>
+                  <w:color w:val="0563C1"/>
+                  <w:u w:val="single"/>
+                </w:rPr>
+                <w:t xml:space="preserve">588K</w:t>
+              </w:r>
+            </w:hyperlink>
+          </w:p>
+        </w:tc>
+        <w:tc>
+          <w:tcPr>
+            <w:tcW w:type="dxa" w:w="1080"/>
+          </w:tcPr>
+          <w:p>
+            <w:pPr>
+              <w:spacing w:after="40"/>
+            </w:pPr>
+            <w:r>
+              <w:rPr>
+                <w:sz w:val="19"/>
+              </w:rPr>
+              <w:t>F1 B</w:t>
             </w:r>
           </w:p>
         </w:tc>
@@ -1116,23 +1350,7 @@
               <w:rPr>
                 <w:sz w:val="19"/>
               </w:rPr>
-              <w:t>F1 B</w:t>
-            </w:r>
-          </w:p>
-        </w:tc>
-        <w:tc>
-          <w:tcPr>
-            <w:tcW w:type="dxa" w:w="1296"/>
-          </w:tcPr>
-          <w:p>
-            <w:pPr>
-              <w:spacing w:after="40"/>
-            </w:pPr>
-            <w:r>
-              <w:rPr>
-                <w:sz w:val="19"/>
-              </w:rPr>
-              <w:t>MEDIUM — repeat</w:t>
+              <w:t>MED, repeat</w:t>
             </w:r>
           </w:p>
         </w:tc>
@@ -1156,7 +1374,7 @@
         </w:tc>
         <w:tc>
           <w:tcPr>
-            <w:tcW w:type="dxa" w:w="1800"/>
+            <w:tcW w:type="dxa" w:w="1152"/>
           </w:tcPr>
           <w:p>
             <w:pPr>
@@ -1173,7 +1391,7 @@
         </w:tc>
         <w:tc>
           <w:tcPr>
-            <w:tcW w:type="dxa" w:w="3744"/>
+            <w:tcW w:type="dxa" w:w="5040"/>
           </w:tcPr>
           <w:p>
             <w:pPr>
@@ -1183,13 +1401,13 @@
               <w:rPr>
                 <w:sz w:val="19"/>
               </w:rPr>
-              <w:t>The arrest is real, so the scam checks out.</w:t>
+              <w:t>Scammers read jail booking lists and call families of people who really were just arrested, demanding bail by Bitcoin ATM or Zelle.</w:t>
             </w:r>
           </w:p>
         </w:tc>
         <w:tc>
           <w:tcPr>
-            <w:tcW w:type="dxa" w:w="1440"/>
+            <w:tcW w:type="dxa" w:w="1008"/>
           </w:tcPr>
           <w:p>
             <w:pPr>
@@ -1205,7 +1423,7 @@
         </w:tc>
         <w:tc>
           <w:tcPr>
-            <w:tcW w:type="dxa" w:w="1224"/>
+            <w:tcW w:type="dxa" w:w="1080"/>
           </w:tcPr>
           <w:p>
             <w:pPr>
@@ -1221,7 +1439,7 @@
         </w:tc>
         <w:tc>
           <w:tcPr>
-            <w:tcW w:type="dxa" w:w="1296"/>
+            <w:tcW w:type="dxa" w:w="1224"/>
           </w:tcPr>
           <w:p>
             <w:pPr>
@@ -1231,7 +1449,7 @@
               <w:rPr>
                 <w:sz w:val="19"/>
               </w:rPr>
-              <w:t>MEDIUM</w:t>
+              <w:t>MED</w:t>
             </w:r>
           </w:p>
         </w:tc>
@@ -1255,7 +1473,7 @@
         </w:tc>
         <w:tc>
           <w:tcPr>
-            <w:tcW w:type="dxa" w:w="1800"/>
+            <w:tcW w:type="dxa" w:w="1152"/>
           </w:tcPr>
           <w:p>
             <w:pPr>
@@ -1272,7 +1490,7 @@
         </w:tc>
         <w:tc>
           <w:tcPr>
-            <w:tcW w:type="dxa" w:w="3744"/>
+            <w:tcW w:type="dxa" w:w="5040"/>
           </w:tcPr>
           <w:p>
             <w:pPr>
@@ -1282,13 +1500,39 @@
               <w:rPr>
                 <w:sz w:val="19"/>
               </w:rPr>
-              <w:t>Same network, cheaper name.</w:t>
+              <w:t>Verizon, AT&amp;T and T-Mobile each own a cheaper brand on the same network. A family of four can save $1,000+ a year by switching.</w:t>
             </w:r>
           </w:p>
         </w:tc>
         <w:tc>
           <w:tcPr>
-            <w:tcW w:type="dxa" w:w="1440"/>
+            <w:tcW w:type="dxa" w:w="1008"/>
+          </w:tcPr>
+          <w:p>
+            <w:pPr>
+              <w:spacing w:after="40"/>
+            </w:pPr>
+            <w:hyperlink r:id="rId26">
+              <w:r>
+                <w:rPr>
+                  <w:sz w:val="19"/>
+                  <w:color w:val="0563C1"/>
+                  <w:u w:val="single"/>
+                </w:rPr>
+                <w:t xml:space="preserve">466K</w:t>
+              </w:r>
+            </w:hyperlink>
+            <w:r>
+              <w:rPr>
+                <w:sz w:val="19"/>
+              </w:rPr>
+              <w:t xml:space="preserve"> (creator)</w:t>
+            </w:r>
+          </w:p>
+        </w:tc>
+        <w:tc>
+          <w:tcPr>
+            <w:tcW w:type="dxa" w:w="1080"/>
           </w:tcPr>
           <w:p>
             <w:pPr>
@@ -1298,7 +1542,7 @@
               <w:rPr>
                 <w:sz w:val="19"/>
               </w:rPr>
-              <w:t>—</w:t>
+              <w:t>F1 C</w:t>
             </w:r>
           </w:p>
         </w:tc>
@@ -1314,23 +1558,7 @@
               <w:rPr>
                 <w:sz w:val="19"/>
               </w:rPr>
-              <w:t>F1 C</w:t>
-            </w:r>
-          </w:p>
-        </w:tc>
-        <w:tc>
-          <w:tcPr>
-            <w:tcW w:type="dxa" w:w="1296"/>
-          </w:tcPr>
-          <w:p>
-            <w:pPr>
-              <w:spacing w:after="40"/>
-            </w:pPr>
-            <w:r>
-              <w:rPr>
-                <w:sz w:val="19"/>
-              </w:rPr>
-              <w:t>MEDIUM</w:t>
+              <w:t>MED</w:t>
             </w:r>
           </w:p>
         </w:tc>
@@ -3902,7 +4130,7 @@
         <w:rPr>
           <w:i/>
         </w:rPr>
-        <w:t xml:space="preserve"> — YouTube, She Prepares "In Case You Don't Believe What Walmart Is Doing," ~3.3M views (observed Oct 11), ~4 weeks · MS NOW, ~588K, 2 days https://www.youtube.com/watch?v=eLwYS9ITuu4 </w:t>
+        <w:t xml:space="preserve"> — YouTube, She Prepares "In Case You Don't Believe What Walmart Is Doing," ~3.3M views (observed Oct 11), ~4 weeks · MS NOW, ~588K, 2 days https://www.youtube.com/watch?v=2vEZsLywo00 · https://www.youtube.com/watch?v=eLwYS9ITuu4 </w:t>
       </w:r>
       <w:r>
         <w:rPr>

</xml_diff>